<commit_message>
WEEK 9: fix GitHub link paths, cover typo, final layout
</commit_message>
<xml_diff>
--- a/WEEK 9/Week9_Programs_18_21.docx
+++ b/WEEK 9/Week9_Programs_18_21.docx
@@ -7711,7 +7711,7 @@
                 <w:color w:val="000000"/>
                 <w:sz w:val="21"/>
               </w:rPr>
-              <w:t>4. Python program (GitHub link): https://github.com/hasnainmakada-99/Data-Science-Codes/blob/main/WEEK%209/Program18_Arrays.scala</w:t>
+              <w:t>4. Python program (GitHub link): https://github.com/hasnainmakada-99/Data-Science-Codes/blob/main/WEEK%209/programs/Program18_Arrays.scala</w:t>
             </w:r>
           </w:p>
         </w:tc>
@@ -10516,7 +10516,7 @@
                 <w:color w:val="000000"/>
                 <w:sz w:val="21"/>
               </w:rPr>
-              <w:t>4. Python program (GitHub link): https://github.com/hasnainmakada-99/Data-Science-Codes/blob/main/WEEK%209/Program19_ListsSetsTuples.scala</w:t>
+              <w:t>4. Python program (GitHub link): https://github.com/hasnainmakada-99/Data-Science-Codes/blob/main/WEEK%209/programs/Program19_ListsSetsTuples.scala</w:t>
             </w:r>
           </w:p>
         </w:tc>
@@ -14049,7 +14049,7 @@
                 <w:color w:val="000000"/>
                 <w:sz w:val="21"/>
               </w:rPr>
-              <w:t>4. Python program (GitHub link): https://github.com/hasnainmakada-99/Data-Science-Codes/blob/main/WEEK%209/Program20_HashMapCollisions.scala</w:t>
+              <w:t>4. Python program (GitHub link): https://github.com/hasnainmakada-99/Data-Science-Codes/blob/main/WEEK%209/programs/Program20_HashMapCollisions.scala</w:t>
             </w:r>
           </w:p>
         </w:tc>
@@ -16930,7 +16930,7 @@
                 <w:color w:val="000000"/>
                 <w:sz w:val="21"/>
               </w:rPr>
-              <w:t>4. Python program (GitHub link): https://github.com/hasnainmakada-99/Data-Science-Codes/blob/main/WEEK%209/Program21_FunctionalCombinators.scala</w:t>
+              <w:t>4. Python program (GitHub link): https://github.com/hasnainmakada-99/Data-Science-Codes/blob/main/WEEK%209/programs/Program21_FunctionalCombinators.scala</w:t>
             </w:r>
           </w:p>
         </w:tc>

</xml_diff>

<commit_message>
WEEK 9: make all reference URLs clickable in the PDF
LibreOffice's PDF export drops hyperlink annotations, so the links are added
as /Link annotations with /URI actions after export. The GitHub source link
spans wrapped lines and is merged into a single annotation. Also ships the
two post-processing tools so the build is reproducible.
</commit_message>
<xml_diff>
--- a/WEEK 9/Week9_Programs_18_21.docx
+++ b/WEEK 9/Week9_Programs_18_21.docx
@@ -7664,36 +7664,52 @@
             <w:r>
               <w:rPr>
                 <w:rFonts w:ascii="Times New Roman" w:hAnsi="Times New Roman"/>
-                <w:b w:val="0"/>
-                <w:color w:val="000000"/>
                 <w:sz w:val="21"/>
               </w:rPr>
-              <w:t>1. Scala Array documentation: https://www.scala-lang.org/api/current/scala/Array.html</w:t>
-            </w:r>
-          </w:p>
-          <w:p>
-            <w:pPr>
-              <w:spacing w:before="0" w:after="0" w:line="240" w:lineRule="auto"/>
-            </w:pPr>
-            <w:r>
-              <w:rPr>
-                <w:rFonts w:ascii="Times New Roman" w:hAnsi="Times New Roman"/>
-                <w:b w:val="0"/>
-                <w:color w:val="000000"/>
+              <w:t xml:space="preserve">1. Scala Array documentation: </w:t>
+            </w:r>
+            <w:hyperlink r:id="rId29">
+              <w:r>
+                <w:rPr>
+                  <w:rFonts w:ascii="Times New Roman" w:hAnsi="Times New Roman"/>
+                  <w:color w:val="0563C1"/>
+                  <w:u w:val="single"/>
+                  <w:sz w:val="21"/>
+                </w:rPr>
+                <w:t xml:space="preserve">https://www.scala-lang.org/api/current/scala/Array.html</w:t>
+              </w:r>
+            </w:hyperlink>
+          </w:p>
+          <w:p>
+            <w:pPr>
+              <w:spacing w:before="0" w:after="0" w:line="240" w:lineRule="auto"/>
+            </w:pPr>
+            <w:r>
+              <w:rPr>
+                <w:rFonts w:ascii="Times New Roman" w:hAnsi="Times New Roman"/>
                 <w:sz w:val="21"/>
               </w:rPr>
-              <w:t>2. Scala Collections overview: https://docs.scala-lang.org/overviews/collections/overview.html</w:t>
-            </w:r>
-          </w:p>
-          <w:p>
-            <w:pPr>
-              <w:spacing w:before="0" w:after="0" w:line="240" w:lineRule="auto"/>
-            </w:pPr>
-            <w:r>
-              <w:rPr>
-                <w:rFonts w:ascii="Times New Roman" w:hAnsi="Times New Roman"/>
-                <w:b w:val="0"/>
-                <w:color w:val="000000"/>
+              <w:t xml:space="preserve">2. Scala Collections overview: </w:t>
+            </w:r>
+            <w:hyperlink r:id="rId30">
+              <w:r>
+                <w:rPr>
+                  <w:rFonts w:ascii="Times New Roman" w:hAnsi="Times New Roman"/>
+                  <w:color w:val="0563C1"/>
+                  <w:u w:val="single"/>
+                  <w:sz w:val="21"/>
+                </w:rPr>
+                <w:t xml:space="preserve">https://docs.scala-lang.org/overviews/collections/overview.html</w:t>
+              </w:r>
+            </w:hyperlink>
+          </w:p>
+          <w:p>
+            <w:pPr>
+              <w:spacing w:before="0" w:after="0" w:line="240" w:lineRule="auto"/>
+            </w:pPr>
+            <w:r>
+              <w:rPr>
+                <w:rFonts w:ascii="Times New Roman" w:hAnsi="Times New Roman"/>
                 <w:sz w:val="21"/>
               </w:rPr>
               <w:t>3. Class lecture: Arrays and array operations in Scala.</w:t>
@@ -7706,12 +7722,21 @@
             <w:r>
               <w:rPr>
                 <w:rFonts w:ascii="Times New Roman" w:hAnsi="Times New Roman"/>
-                <w:b w:val="0"/>
-                <w:color w:val="000000"/>
                 <w:sz w:val="21"/>
               </w:rPr>
-              <w:t>4. Python program (GitHub link): https://github.com/hasnainmakada-99/Data-Science-Codes/blob/main/WEEK%209/programs/Program18_Arrays.scala</w:t>
-            </w:r>
+              <w:t xml:space="preserve">4. Python program (GitHub link): </w:t>
+            </w:r>
+            <w:hyperlink r:id="rId31">
+              <w:r>
+                <w:rPr>
+                  <w:rFonts w:ascii="Times New Roman" w:hAnsi="Times New Roman"/>
+                  <w:color w:val="0563C1"/>
+                  <w:u w:val="single"/>
+                  <w:sz w:val="21"/>
+                </w:rPr>
+                <w:t xml:space="preserve">https://github.com/hasnainmakada-99/Data-Science-Codes/blob/main/WEEK%209/programs/Program18_Arrays.scala</w:t>
+              </w:r>
+            </w:hyperlink>
           </w:p>
         </w:tc>
       </w:tr>
@@ -10264,7 +10289,7 @@
                           <pic:cNvPicPr/>
                         </pic:nvPicPr>
                         <pic:blipFill>
-                          <a:blip r:embed="rId31"/>
+                          <a:blip r:embed="rId34"/>
                           <a:stretch>
                             <a:fillRect/>
                           </a:stretch>
@@ -10350,7 +10375,7 @@
                           <pic:cNvPicPr/>
                         </pic:nvPicPr>
                         <pic:blipFill>
-                          <a:blip r:embed="rId32"/>
+                          <a:blip r:embed="rId35"/>
                           <a:stretch>
                             <a:fillRect/>
                           </a:stretch>
@@ -10469,54 +10494,90 @@
             <w:r>
               <w:rPr>
                 <w:rFonts w:ascii="Times New Roman" w:hAnsi="Times New Roman"/>
-                <w:b w:val="0"/>
-                <w:color w:val="000000"/>
                 <w:sz w:val="21"/>
               </w:rPr>
-              <w:t>1. Scala List documentation: https://www.scala-lang.org/api/current/scala/collection/immutable/List.html</w:t>
-            </w:r>
-          </w:p>
-          <w:p>
-            <w:pPr>
-              <w:spacing w:before="0" w:after="0" w:line="240" w:lineRule="auto"/>
-            </w:pPr>
-            <w:r>
-              <w:rPr>
-                <w:rFonts w:ascii="Times New Roman" w:hAnsi="Times New Roman"/>
-                <w:b w:val="0"/>
-                <w:color w:val="000000"/>
+              <w:t xml:space="preserve">1. Scala List documentation: </w:t>
+            </w:r>
+            <w:hyperlink r:id="rId36">
+              <w:r>
+                <w:rPr>
+                  <w:rFonts w:ascii="Times New Roman" w:hAnsi="Times New Roman"/>
+                  <w:color w:val="0563C1"/>
+                  <w:u w:val="single"/>
+                  <w:sz w:val="21"/>
+                </w:rPr>
+                <w:t xml:space="preserve">https://www.scala-lang.org/api/current/scala/collection/immutable/List.html</w:t>
+              </w:r>
+            </w:hyperlink>
+          </w:p>
+          <w:p>
+            <w:pPr>
+              <w:spacing w:before="0" w:after="0" w:line="240" w:lineRule="auto"/>
+            </w:pPr>
+            <w:r>
+              <w:rPr>
+                <w:rFonts w:ascii="Times New Roman" w:hAnsi="Times New Roman"/>
                 <w:sz w:val="21"/>
               </w:rPr>
-              <w:t>2. Scala Set documentation: https://www.scala-lang.org/api/current/scala/collection/immutable/Set.html</w:t>
-            </w:r>
-          </w:p>
-          <w:p>
-            <w:pPr>
-              <w:spacing w:before="0" w:after="0" w:line="240" w:lineRule="auto"/>
-            </w:pPr>
-            <w:r>
-              <w:rPr>
-                <w:rFonts w:ascii="Times New Roman" w:hAnsi="Times New Roman"/>
-                <w:b w:val="0"/>
-                <w:color w:val="000000"/>
+              <w:t xml:space="preserve">2. Scala Set documentation: </w:t>
+            </w:r>
+            <w:hyperlink r:id="rId37">
+              <w:r>
+                <w:rPr>
+                  <w:rFonts w:ascii="Times New Roman" w:hAnsi="Times New Roman"/>
+                  <w:color w:val="0563C1"/>
+                  <w:u w:val="single"/>
+                  <w:sz w:val="21"/>
+                </w:rPr>
+                <w:t xml:space="preserve">https://www.scala-lang.org/api/current/scala/collection/immutable/Set.html</w:t>
+              </w:r>
+            </w:hyperlink>
+          </w:p>
+          <w:p>
+            <w:pPr>
+              <w:spacing w:before="0" w:after="0" w:line="240" w:lineRule="auto"/>
+            </w:pPr>
+            <w:r>
+              <w:rPr>
+                <w:rFonts w:ascii="Times New Roman" w:hAnsi="Times New Roman"/>
                 <w:sz w:val="21"/>
               </w:rPr>
-              <w:t>3. Scala Tuples guide: https://docs.scala-lang.org/tour/tuples.html</w:t>
-            </w:r>
-          </w:p>
-          <w:p>
-            <w:pPr>
-              <w:spacing w:before="0" w:after="0" w:line="240" w:lineRule="auto"/>
-            </w:pPr>
-            <w:r>
-              <w:rPr>
-                <w:rFonts w:ascii="Times New Roman" w:hAnsi="Times New Roman"/>
-                <w:b w:val="0"/>
-                <w:color w:val="000000"/>
+              <w:t xml:space="preserve">3. Scala Tuples guide: </w:t>
+            </w:r>
+            <w:hyperlink r:id="rId38">
+              <w:r>
+                <w:rPr>
+                  <w:rFonts w:ascii="Times New Roman" w:hAnsi="Times New Roman"/>
+                  <w:color w:val="0563C1"/>
+                  <w:u w:val="single"/>
+                  <w:sz w:val="21"/>
+                </w:rPr>
+                <w:t xml:space="preserve">https://docs.scala-lang.org/tour/tuples.html</w:t>
+              </w:r>
+            </w:hyperlink>
+          </w:p>
+          <w:p>
+            <w:pPr>
+              <w:spacing w:before="0" w:after="0" w:line="240" w:lineRule="auto"/>
+            </w:pPr>
+            <w:r>
+              <w:rPr>
+                <w:rFonts w:ascii="Times New Roman" w:hAnsi="Times New Roman"/>
                 <w:sz w:val="21"/>
               </w:rPr>
-              <w:t>4. Python program (GitHub link): https://github.com/hasnainmakada-99/Data-Science-Codes/blob/main/WEEK%209/programs/Program19_ListsSetsTuples.scala</w:t>
-            </w:r>
+              <w:t xml:space="preserve">4. Python program (GitHub link): </w:t>
+            </w:r>
+            <w:hyperlink r:id="rId39">
+              <w:r>
+                <w:rPr>
+                  <w:rFonts w:ascii="Times New Roman" w:hAnsi="Times New Roman"/>
+                  <w:color w:val="0563C1"/>
+                  <w:u w:val="single"/>
+                  <w:sz w:val="21"/>
+                </w:rPr>
+                <w:t xml:space="preserve">https://github.com/hasnainmakada-99/Data-Science-Codes/blob/main/WEEK%209/programs/Program19_ListsSetsTuples.scala</w:t>
+              </w:r>
+            </w:hyperlink>
           </w:p>
         </w:tc>
       </w:tr>
@@ -10524,8 +10585,8 @@
     <w:p>
       <w:pPr>
         <w:sectPr>
-          <w:headerReference w:type="default" r:id="rId29"/>
-          <w:footerReference w:type="default" r:id="rId30"/>
+          <w:headerReference w:type="default" r:id="rId32"/>
+          <w:footerReference w:type="default" r:id="rId33"/>
           <w:pgSz w:w="11906" w:h="16838" w:code="9"/>
           <w:pgMar w:top="1440" w:right="1440" w:bottom="1440" w:left="1440" w:header="709" w:footer="709" w:gutter="0"/>
           <w:pgBorders w:display="allPages" w:offsetFrom="page">
@@ -13797,7 +13858,7 @@
                           <pic:cNvPicPr/>
                         </pic:nvPicPr>
                         <pic:blipFill>
-                          <a:blip r:embed="rId35"/>
+                          <a:blip r:embed="rId42"/>
                           <a:stretch>
                             <a:fillRect/>
                           </a:stretch>
@@ -13883,7 +13944,7 @@
                           <pic:cNvPicPr/>
                         </pic:nvPicPr>
                         <pic:blipFill>
-                          <a:blip r:embed="rId36"/>
+                          <a:blip r:embed="rId43"/>
                           <a:stretch>
                             <a:fillRect/>
                           </a:stretch>
@@ -14002,36 +14063,52 @@
             <w:r>
               <w:rPr>
                 <w:rFonts w:ascii="Times New Roman" w:hAnsi="Times New Roman"/>
-                <w:b w:val="0"/>
-                <w:color w:val="000000"/>
                 <w:sz w:val="21"/>
               </w:rPr>
-              <w:t>1. Scala HashMap documentation: https://www.scala-lang.org/api/current/scala/collection/mutable/HashMap.html</w:t>
-            </w:r>
-          </w:p>
-          <w:p>
-            <w:pPr>
-              <w:spacing w:before="0" w:after="0" w:line="240" w:lineRule="auto"/>
-            </w:pPr>
-            <w:r>
-              <w:rPr>
-                <w:rFonts w:ascii="Times New Roman" w:hAnsi="Times New Roman"/>
-                <w:b w:val="0"/>
-                <w:color w:val="000000"/>
+              <w:t xml:space="preserve">1. Scala HashMap documentation: </w:t>
+            </w:r>
+            <w:hyperlink r:id="rId44">
+              <w:r>
+                <w:rPr>
+                  <w:rFonts w:ascii="Times New Roman" w:hAnsi="Times New Roman"/>
+                  <w:color w:val="0563C1"/>
+                  <w:u w:val="single"/>
+                  <w:sz w:val="21"/>
+                </w:rPr>
+                <w:t xml:space="preserve">https://www.scala-lang.org/api/current/scala/collection/mutable/HashMap.html</w:t>
+              </w:r>
+            </w:hyperlink>
+          </w:p>
+          <w:p>
+            <w:pPr>
+              <w:spacing w:before="0" w:after="0" w:line="240" w:lineRule="auto"/>
+            </w:pPr>
+            <w:r>
+              <w:rPr>
+                <w:rFonts w:ascii="Times New Roman" w:hAnsi="Times New Roman"/>
                 <w:sz w:val="21"/>
               </w:rPr>
-              <w:t>2. Hash table collision resolution: https://en.wikipedia.org/wiki/Hash_table#Collision_resolution</w:t>
-            </w:r>
-          </w:p>
-          <w:p>
-            <w:pPr>
-              <w:spacing w:before="0" w:after="0" w:line="240" w:lineRule="auto"/>
-            </w:pPr>
-            <w:r>
-              <w:rPr>
-                <w:rFonts w:ascii="Times New Roman" w:hAnsi="Times New Roman"/>
-                <w:b w:val="0"/>
-                <w:color w:val="000000"/>
+              <w:t xml:space="preserve">2. Hash table collision resolution: </w:t>
+            </w:r>
+            <w:hyperlink r:id="rId45">
+              <w:r>
+                <w:rPr>
+                  <w:rFonts w:ascii="Times New Roman" w:hAnsi="Times New Roman"/>
+                  <w:color w:val="0563C1"/>
+                  <w:u w:val="single"/>
+                  <w:sz w:val="21"/>
+                </w:rPr>
+                <w:t xml:space="preserve">https://en.wikipedia.org/wiki/Hash_table#Collision_resolution</w:t>
+              </w:r>
+            </w:hyperlink>
+          </w:p>
+          <w:p>
+            <w:pPr>
+              <w:spacing w:before="0" w:after="0" w:line="240" w:lineRule="auto"/>
+            </w:pPr>
+            <w:r>
+              <w:rPr>
+                <w:rFonts w:ascii="Times New Roman" w:hAnsi="Times New Roman"/>
                 <w:sz w:val="21"/>
               </w:rPr>
               <w:t>3. Class lecture: Maps and HashMaps in Scala.</w:t>
@@ -14044,12 +14121,21 @@
             <w:r>
               <w:rPr>
                 <w:rFonts w:ascii="Times New Roman" w:hAnsi="Times New Roman"/>
-                <w:b w:val="0"/>
-                <w:color w:val="000000"/>
                 <w:sz w:val="21"/>
               </w:rPr>
-              <w:t>4. Python program (GitHub link): https://github.com/hasnainmakada-99/Data-Science-Codes/blob/main/WEEK%209/programs/Program20_HashMapCollisions.scala</w:t>
-            </w:r>
+              <w:t xml:space="preserve">4. Python program (GitHub link): </w:t>
+            </w:r>
+            <w:hyperlink r:id="rId46">
+              <w:r>
+                <w:rPr>
+                  <w:rFonts w:ascii="Times New Roman" w:hAnsi="Times New Roman"/>
+                  <w:color w:val="0563C1"/>
+                  <w:u w:val="single"/>
+                  <w:sz w:val="21"/>
+                </w:rPr>
+                <w:t xml:space="preserve">https://github.com/hasnainmakada-99/Data-Science-Codes/blob/main/WEEK%209/programs/Program20_HashMapCollisions.scala</w:t>
+              </w:r>
+            </w:hyperlink>
           </w:p>
         </w:tc>
       </w:tr>
@@ -14057,8 +14143,8 @@
     <w:p>
       <w:pPr>
         <w:sectPr>
-          <w:headerReference w:type="default" r:id="rId33"/>
-          <w:footerReference w:type="default" r:id="rId34"/>
+          <w:headerReference w:type="default" r:id="rId40"/>
+          <w:footerReference w:type="default" r:id="rId41"/>
           <w:pgSz w:w="11906" w:h="16838" w:code="9"/>
           <w:pgMar w:top="1440" w:right="1440" w:bottom="1440" w:left="1440" w:header="709" w:footer="709" w:gutter="0"/>
           <w:pgBorders w:display="allPages" w:offsetFrom="page">
@@ -16678,7 +16764,7 @@
                           <pic:cNvPicPr/>
                         </pic:nvPicPr>
                         <pic:blipFill>
-                          <a:blip r:embed="rId39"/>
+                          <a:blip r:embed="rId49"/>
                           <a:stretch>
                             <a:fillRect/>
                           </a:stretch>
@@ -16764,7 +16850,7 @@
                           <pic:cNvPicPr/>
                         </pic:nvPicPr>
                         <pic:blipFill>
-                          <a:blip r:embed="rId40"/>
+                          <a:blip r:embed="rId50"/>
                           <a:stretch>
                             <a:fillRect/>
                           </a:stretch>
@@ -16883,36 +16969,52 @@
             <w:r>
               <w:rPr>
                 <w:rFonts w:ascii="Times New Roman" w:hAnsi="Times New Roman"/>
-                <w:b w:val="0"/>
-                <w:color w:val="000000"/>
                 <w:sz w:val="21"/>
               </w:rPr>
-              <w:t>1. Scala collections operations: https://docs.scala-lang.org/overviews/collections/operations.html</w:t>
-            </w:r>
-          </w:p>
-          <w:p>
-            <w:pPr>
-              <w:spacing w:before="0" w:after="0" w:line="240" w:lineRule="auto"/>
-            </w:pPr>
-            <w:r>
-              <w:rPr>
-                <w:rFonts w:ascii="Times New Roman" w:hAnsi="Times New Roman"/>
-                <w:b w:val="0"/>
-                <w:color w:val="000000"/>
+              <w:t xml:space="preserve">1. Scala collections operations: </w:t>
+            </w:r>
+            <w:hyperlink r:id="rId51">
+              <w:r>
+                <w:rPr>
+                  <w:rFonts w:ascii="Times New Roman" w:hAnsi="Times New Roman"/>
+                  <w:color w:val="0563C1"/>
+                  <w:u w:val="single"/>
+                  <w:sz w:val="21"/>
+                </w:rPr>
+                <w:t xml:space="preserve">https://docs.scala-lang.org/overviews/collections/operations.html</w:t>
+              </w:r>
+            </w:hyperlink>
+          </w:p>
+          <w:p>
+            <w:pPr>
+              <w:spacing w:before="0" w:after="0" w:line="240" w:lineRule="auto"/>
+            </w:pPr>
+            <w:r>
+              <w:rPr>
+                <w:rFonts w:ascii="Times New Roman" w:hAnsi="Times New Roman"/>
                 <w:sz w:val="21"/>
               </w:rPr>
-              <w:t>2. Scala tour: anonymous function syntax: https://docs.scala-lang.org/tour/anonymous-function-syntax.html</w:t>
-            </w:r>
-          </w:p>
-          <w:p>
-            <w:pPr>
-              <w:spacing w:before="0" w:after="0" w:line="240" w:lineRule="auto"/>
-            </w:pPr>
-            <w:r>
-              <w:rPr>
-                <w:rFonts w:ascii="Times New Roman" w:hAnsi="Times New Roman"/>
-                <w:b w:val="0"/>
-                <w:color w:val="000000"/>
+              <w:t xml:space="preserve">2. Scala tour: anonymous function syntax: </w:t>
+            </w:r>
+            <w:hyperlink r:id="rId52">
+              <w:r>
+                <w:rPr>
+                  <w:rFonts w:ascii="Times New Roman" w:hAnsi="Times New Roman"/>
+                  <w:color w:val="0563C1"/>
+                  <w:u w:val="single"/>
+                  <w:sz w:val="21"/>
+                </w:rPr>
+                <w:t xml:space="preserve">https://docs.scala-lang.org/tour/anonymous-function-syntax.html</w:t>
+              </w:r>
+            </w:hyperlink>
+          </w:p>
+          <w:p>
+            <w:pPr>
+              <w:spacing w:before="0" w:after="0" w:line="240" w:lineRule="auto"/>
+            </w:pPr>
+            <w:r>
+              <w:rPr>
+                <w:rFonts w:ascii="Times New Roman" w:hAnsi="Times New Roman"/>
                 <w:sz w:val="21"/>
               </w:rPr>
               <w:t>3. Class lecture: Functional combinators in Scala.</w:t>
@@ -16925,19 +17027,28 @@
             <w:r>
               <w:rPr>
                 <w:rFonts w:ascii="Times New Roman" w:hAnsi="Times New Roman"/>
-                <w:b w:val="0"/>
-                <w:color w:val="000000"/>
                 <w:sz w:val="21"/>
               </w:rPr>
-              <w:t>4. Python program (GitHub link): https://github.com/hasnainmakada-99/Data-Science-Codes/blob/main/WEEK%209/programs/Program21_FunctionalCombinators.scala</w:t>
-            </w:r>
+              <w:t xml:space="preserve">4. Python program (GitHub link): </w:t>
+            </w:r>
+            <w:hyperlink r:id="rId53">
+              <w:r>
+                <w:rPr>
+                  <w:rFonts w:ascii="Times New Roman" w:hAnsi="Times New Roman"/>
+                  <w:color w:val="0563C1"/>
+                  <w:u w:val="single"/>
+                  <w:sz w:val="21"/>
+                </w:rPr>
+                <w:t xml:space="preserve">https://github.com/hasnainmakada-99/Data-Science-Codes/blob/main/WEEK%209/programs/Program21_FunctionalCombinators.scala</w:t>
+              </w:r>
+            </w:hyperlink>
           </w:p>
         </w:tc>
       </w:tr>
     </w:tbl>
     <w:sectPr>
-      <w:headerReference w:type="default" r:id="rId37"/>
-      <w:footerReference w:type="default" r:id="rId38"/>
+      <w:headerReference w:type="default" r:id="rId47"/>
+      <w:footerReference w:type="default" r:id="rId48"/>
       <w:pgSz w:w="11906" w:h="16838" w:code="9"/>
       <w:pgMar w:top="1440" w:right="1440" w:bottom="1440" w:left="1440" w:header="709" w:footer="709" w:gutter="0"/>
       <w:pgBorders w:display="allPages" w:offsetFrom="page">

</xml_diff>

<commit_message>
WEEK 9: cover headings to Week 8 orange, fix photo circle detection
- cover heading text 385623 (dark green) -> C45911, matching Week 8
- photo placement now picks the first orange banner at least 100px tall,
  so the student photo lands in the Reg No / Name circle rather than a
  stray glyph or the faculty banner
</commit_message>
<xml_diff>
--- a/WEEK 9/Week9_Programs_18_21.docx
+++ b/WEEK 9/Week9_Programs_18_21.docx
@@ -19,7 +19,7 @@
         <w:jc w:val="center"/>
         <w:rPr>
           <w:b/>
-          <w:color w:val="385623" w:themeColor="accent6" w:themeShade="80"/>
+          <w:color w:val="C45911" w:themeColor="accent2" w:themeShade="BF"/>
           <w:sz w:val="64"/>
           <w:szCs w:val="36"/>
         </w:rPr>
@@ -27,7 +27,7 @@
       <w:r>
         <w:rPr>
           <w:b/>
-          <w:color w:val="385623" w:themeColor="accent6" w:themeShade="80"/>
+          <w:color w:val="C45911" w:themeColor="accent2" w:themeShade="BF"/>
           <w:sz w:val="64"/>
           <w:szCs w:val="36"/>
         </w:rPr>
@@ -40,7 +40,7 @@
         <w:jc w:val="center"/>
         <w:rPr>
           <w:b/>
-          <w:color w:val="385623" w:themeColor="accent6" w:themeShade="80"/>
+          <w:color w:val="C45911" w:themeColor="accent2" w:themeShade="BF"/>
           <w:sz w:val="28"/>
           <w:szCs w:val="28"/>
         </w:rPr>
@@ -49,7 +49,7 @@
         <w:rPr>
           <w:b/>
           <w:noProof/>
-          <w:color w:val="385623" w:themeColor="accent6" w:themeShade="80"/>
+          <w:color w:val="C45911" w:themeColor="accent2" w:themeShade="BF"/>
           <w:sz w:val="28"/>
           <w:szCs w:val="28"/>
           <w:lang w:eastAsia="en-IN"/>
@@ -64,7 +64,7 @@
         <w:rPr>
           <w:b/>
           <w:noProof/>
-          <w:color w:val="385623" w:themeColor="accent6" w:themeShade="80"/>
+          <w:color w:val="C45911" w:themeColor="accent2" w:themeShade="BF"/>
           <w:sz w:val="58"/>
           <w:lang w:eastAsia="en-IN"/>
         </w:rPr>
@@ -73,7 +73,7 @@
         <w:rPr>
           <w:b/>
           <w:noProof/>
-          <w:color w:val="385623" w:themeColor="accent6" w:themeShade="80"/>
+          <w:color w:val="C45911" w:themeColor="accent2" w:themeShade="BF"/>
           <w:sz w:val="58"/>
           <w:lang w:eastAsia="en-IN"/>
         </w:rPr>
@@ -87,7 +87,7 @@
         <w:rPr>
           <w:b/>
           <w:noProof/>
-          <w:color w:val="385623" w:themeColor="accent6" w:themeShade="80"/>
+          <w:color w:val="C45911" w:themeColor="accent2" w:themeShade="BF"/>
           <w:sz w:val="58"/>
           <w:lang w:eastAsia="en-IN"/>
         </w:rPr>
@@ -96,7 +96,7 @@
         <w:rPr>
           <w:b/>
           <w:noProof/>
-          <w:color w:val="385623" w:themeColor="accent6" w:themeShade="80"/>
+          <w:color w:val="C45911" w:themeColor="accent2" w:themeShade="BF"/>
           <w:sz w:val="58"/>
           <w:lang w:eastAsia="en-IN"/>
         </w:rPr>
@@ -106,7 +106,7 @@
         <w:rPr>
           <w:b/>
           <w:noProof/>
-          <w:color w:val="385623" w:themeColor="accent6" w:themeShade="80"/>
+          <w:color w:val="C45911" w:themeColor="accent2" w:themeShade="BF"/>
           <w:sz w:val="58"/>
           <w:lang w:eastAsia="en-IN"/>
         </w:rPr>
@@ -120,7 +120,7 @@
         <w:rPr>
           <w:b/>
           <w:noProof/>
-          <w:color w:val="385623" w:themeColor="accent6" w:themeShade="80"/>
+          <w:color w:val="C45911" w:themeColor="accent2" w:themeShade="BF"/>
           <w:sz w:val="42"/>
           <w:lang w:eastAsia="en-IN"/>
         </w:rPr>
@@ -129,7 +129,7 @@
         <w:rPr>
           <w:b/>
           <w:noProof/>
-          <w:color w:val="385623" w:themeColor="accent6" w:themeShade="80"/>
+          <w:color w:val="C45911" w:themeColor="accent2" w:themeShade="BF"/>
           <w:sz w:val="42"/>
           <w:highlight w:val="lightGray"/>
           <w:lang w:eastAsia="en-IN"/>
@@ -140,7 +140,7 @@
         <w:rPr>
           <w:b/>
           <w:noProof/>
-          <w:color w:val="385623" w:themeColor="accent6" w:themeShade="80"/>
+          <w:color w:val="C45911" w:themeColor="accent2" w:themeShade="BF"/>
           <w:sz w:val="42"/>
           <w:highlight w:val="lightGray"/>
           <w:lang w:eastAsia="en-IN"/>
@@ -151,7 +151,7 @@
         <w:rPr>
           <w:b/>
           <w:noProof/>
-          <w:color w:val="385623" w:themeColor="accent6" w:themeShade="80"/>
+          <w:color w:val="C45911" w:themeColor="accent2" w:themeShade="BF"/>
           <w:sz w:val="42"/>
           <w:highlight w:val="lightGray"/>
           <w:lang w:eastAsia="en-IN"/>
@@ -207,7 +207,7 @@
         <w:rPr>
           <w:b/>
           <w:noProof/>
-          <w:color w:val="385623" w:themeColor="accent6" w:themeShade="80"/>
+          <w:color w:val="C45911" w:themeColor="accent2" w:themeShade="BF"/>
           <w:sz w:val="30"/>
           <w:lang w:eastAsia="en-IN"/>
         </w:rPr>
@@ -216,7 +216,7 @@
         <w:rPr>
           <w:b/>
           <w:noProof/>
-          <w:color w:val="385623" w:themeColor="accent6" w:themeShade="80"/>
+          <w:color w:val="C45911" w:themeColor="accent2" w:themeShade="BF"/>
           <w:sz w:val="30"/>
           <w:lang w:eastAsia="en-IN"/>
         </w:rPr>
@@ -478,14 +478,14 @@
         <w:jc w:val="center"/>
         <w:rPr>
           <w:noProof/>
-          <w:color w:val="385623" w:themeColor="accent6" w:themeShade="80"/>
+          <w:color w:val="C45911" w:themeColor="accent2" w:themeShade="BF"/>
           <w:lang w:eastAsia="en-IN"/>
         </w:rPr>
       </w:pPr>
       <w:r>
         <w:rPr>
           <w:noProof/>
-          <w:color w:val="385623" w:themeColor="accent6" w:themeShade="80"/>
+          <w:color w:val="C45911" w:themeColor="accent2" w:themeShade="BF"/>
           <w:lang w:eastAsia="en-IN"/>
         </w:rPr>
         <w:drawing>
@@ -568,7 +568,7 @@
           <w:b/>
           <w:bCs/>
           <w:noProof/>
-          <w:color w:val="385623" w:themeColor="accent6" w:themeShade="80"/>
+          <w:color w:val="C45911" w:themeColor="accent2" w:themeShade="BF"/>
           <w:sz w:val="42"/>
           <w:lang w:val="en-US" w:eastAsia="en-IN"/>
         </w:rPr>
@@ -579,7 +579,7 @@
           <w:b/>
           <w:bCs/>
           <w:noProof/>
-          <w:color w:val="385623" w:themeColor="accent6" w:themeShade="80"/>
+          <w:color w:val="C45911" w:themeColor="accent2" w:themeShade="BF"/>
           <w:sz w:val="42"/>
           <w:lang w:val="en-US" w:eastAsia="en-IN"/>
         </w:rPr>
@@ -592,7 +592,7 @@
         <w:jc w:val="center"/>
         <w:rPr>
           <w:b/>
-          <w:color w:val="385623" w:themeColor="accent6" w:themeShade="80"/>
+          <w:color w:val="C45911" w:themeColor="accent2" w:themeShade="BF"/>
           <w:szCs w:val="24"/>
         </w:rPr>
       </w:pPr>
@@ -600,7 +600,7 @@
         <w:rPr>
           <w:b/>
           <w:noProof/>
-          <w:color w:val="385623" w:themeColor="accent6" w:themeShade="80"/>
+          <w:color w:val="C45911" w:themeColor="accent2" w:themeShade="BF"/>
           <w:sz w:val="32"/>
           <w:lang w:eastAsia="en-IN"/>
         </w:rPr>
@@ -610,7 +610,7 @@
         <w:rPr>
           <w:b/>
           <w:noProof/>
-          <w:color w:val="385623" w:themeColor="accent6" w:themeShade="80"/>
+          <w:color w:val="C45911" w:themeColor="accent2" w:themeShade="BF"/>
           <w:sz w:val="32"/>
           <w:lang w:eastAsia="en-IN"/>
         </w:rPr>

</xml_diff>

<commit_message>
WEEK 9: restore the template's green cover headings
The professor's Week 9 cover demo keeps the dark-green (385623) headings over
orange banners, so the earlier recolour to C45911 was wrong. Headings are now
left exactly as the template ships them; only the page background is white and
the LAB ASSESESMENT typo is corrected.
</commit_message>
<xml_diff>
--- a/WEEK 9/Week9_Programs_18_21.docx
+++ b/WEEK 9/Week9_Programs_18_21.docx
@@ -19,7 +19,7 @@
         <w:jc w:val="center"/>
         <w:rPr>
           <w:b/>
-          <w:color w:val="C45911" w:themeColor="accent2" w:themeShade="BF"/>
+          <w:color w:val="385623" w:themeColor="accent6" w:themeShade="80"/>
           <w:sz w:val="64"/>
           <w:szCs w:val="36"/>
         </w:rPr>
@@ -27,7 +27,7 @@
       <w:r>
         <w:rPr>
           <w:b/>
-          <w:color w:val="C45911" w:themeColor="accent2" w:themeShade="BF"/>
+          <w:color w:val="385623" w:themeColor="accent6" w:themeShade="80"/>
           <w:sz w:val="64"/>
           <w:szCs w:val="36"/>
         </w:rPr>
@@ -40,7 +40,7 @@
         <w:jc w:val="center"/>
         <w:rPr>
           <w:b/>
-          <w:color w:val="C45911" w:themeColor="accent2" w:themeShade="BF"/>
+          <w:color w:val="385623" w:themeColor="accent6" w:themeShade="80"/>
           <w:sz w:val="28"/>
           <w:szCs w:val="28"/>
         </w:rPr>
@@ -49,7 +49,7 @@
         <w:rPr>
           <w:b/>
           <w:noProof/>
-          <w:color w:val="C45911" w:themeColor="accent2" w:themeShade="BF"/>
+          <w:color w:val="385623" w:themeColor="accent6" w:themeShade="80"/>
           <w:sz w:val="28"/>
           <w:szCs w:val="28"/>
           <w:lang w:eastAsia="en-IN"/>
@@ -64,7 +64,7 @@
         <w:rPr>
           <w:b/>
           <w:noProof/>
-          <w:color w:val="C45911" w:themeColor="accent2" w:themeShade="BF"/>
+          <w:color w:val="385623" w:themeColor="accent6" w:themeShade="80"/>
           <w:sz w:val="58"/>
           <w:lang w:eastAsia="en-IN"/>
         </w:rPr>
@@ -73,7 +73,7 @@
         <w:rPr>
           <w:b/>
           <w:noProof/>
-          <w:color w:val="C45911" w:themeColor="accent2" w:themeShade="BF"/>
+          <w:color w:val="385623" w:themeColor="accent6" w:themeShade="80"/>
           <w:sz w:val="58"/>
           <w:lang w:eastAsia="en-IN"/>
         </w:rPr>
@@ -87,7 +87,7 @@
         <w:rPr>
           <w:b/>
           <w:noProof/>
-          <w:color w:val="C45911" w:themeColor="accent2" w:themeShade="BF"/>
+          <w:color w:val="385623" w:themeColor="accent6" w:themeShade="80"/>
           <w:sz w:val="58"/>
           <w:lang w:eastAsia="en-IN"/>
         </w:rPr>
@@ -96,7 +96,7 @@
         <w:rPr>
           <w:b/>
           <w:noProof/>
-          <w:color w:val="C45911" w:themeColor="accent2" w:themeShade="BF"/>
+          <w:color w:val="385623" w:themeColor="accent6" w:themeShade="80"/>
           <w:sz w:val="58"/>
           <w:lang w:eastAsia="en-IN"/>
         </w:rPr>
@@ -106,7 +106,7 @@
         <w:rPr>
           <w:b/>
           <w:noProof/>
-          <w:color w:val="C45911" w:themeColor="accent2" w:themeShade="BF"/>
+          <w:color w:val="385623" w:themeColor="accent6" w:themeShade="80"/>
           <w:sz w:val="58"/>
           <w:lang w:eastAsia="en-IN"/>
         </w:rPr>
@@ -120,7 +120,7 @@
         <w:rPr>
           <w:b/>
           <w:noProof/>
-          <w:color w:val="C45911" w:themeColor="accent2" w:themeShade="BF"/>
+          <w:color w:val="385623" w:themeColor="accent6" w:themeShade="80"/>
           <w:sz w:val="42"/>
           <w:lang w:eastAsia="en-IN"/>
         </w:rPr>
@@ -129,7 +129,7 @@
         <w:rPr>
           <w:b/>
           <w:noProof/>
-          <w:color w:val="C45911" w:themeColor="accent2" w:themeShade="BF"/>
+          <w:color w:val="385623" w:themeColor="accent6" w:themeShade="80"/>
           <w:sz w:val="42"/>
           <w:highlight w:val="lightGray"/>
           <w:lang w:eastAsia="en-IN"/>
@@ -140,7 +140,7 @@
         <w:rPr>
           <w:b/>
           <w:noProof/>
-          <w:color w:val="C45911" w:themeColor="accent2" w:themeShade="BF"/>
+          <w:color w:val="385623" w:themeColor="accent6" w:themeShade="80"/>
           <w:sz w:val="42"/>
           <w:highlight w:val="lightGray"/>
           <w:lang w:eastAsia="en-IN"/>
@@ -151,7 +151,7 @@
         <w:rPr>
           <w:b/>
           <w:noProof/>
-          <w:color w:val="C45911" w:themeColor="accent2" w:themeShade="BF"/>
+          <w:color w:val="385623" w:themeColor="accent6" w:themeShade="80"/>
           <w:sz w:val="42"/>
           <w:highlight w:val="lightGray"/>
           <w:lang w:eastAsia="en-IN"/>
@@ -207,7 +207,7 @@
         <w:rPr>
           <w:b/>
           <w:noProof/>
-          <w:color w:val="C45911" w:themeColor="accent2" w:themeShade="BF"/>
+          <w:color w:val="385623" w:themeColor="accent6" w:themeShade="80"/>
           <w:sz w:val="30"/>
           <w:lang w:eastAsia="en-IN"/>
         </w:rPr>
@@ -216,7 +216,7 @@
         <w:rPr>
           <w:b/>
           <w:noProof/>
-          <w:color w:val="C45911" w:themeColor="accent2" w:themeShade="BF"/>
+          <w:color w:val="385623" w:themeColor="accent6" w:themeShade="80"/>
           <w:sz w:val="30"/>
           <w:lang w:eastAsia="en-IN"/>
         </w:rPr>
@@ -478,14 +478,14 @@
         <w:jc w:val="center"/>
         <w:rPr>
           <w:noProof/>
-          <w:color w:val="C45911" w:themeColor="accent2" w:themeShade="BF"/>
+          <w:color w:val="385623" w:themeColor="accent6" w:themeShade="80"/>
           <w:lang w:eastAsia="en-IN"/>
         </w:rPr>
       </w:pPr>
       <w:r>
         <w:rPr>
           <w:noProof/>
-          <w:color w:val="C45911" w:themeColor="accent2" w:themeShade="BF"/>
+          <w:color w:val="385623" w:themeColor="accent6" w:themeShade="80"/>
           <w:lang w:eastAsia="en-IN"/>
         </w:rPr>
         <w:drawing>
@@ -568,7 +568,7 @@
           <w:b/>
           <w:bCs/>
           <w:noProof/>
-          <w:color w:val="C45911" w:themeColor="accent2" w:themeShade="BF"/>
+          <w:color w:val="385623" w:themeColor="accent6" w:themeShade="80"/>
           <w:sz w:val="42"/>
           <w:lang w:val="en-US" w:eastAsia="en-IN"/>
         </w:rPr>
@@ -579,7 +579,7 @@
           <w:b/>
           <w:bCs/>
           <w:noProof/>
-          <w:color w:val="C45911" w:themeColor="accent2" w:themeShade="BF"/>
+          <w:color w:val="385623" w:themeColor="accent6" w:themeShade="80"/>
           <w:sz w:val="42"/>
           <w:lang w:val="en-US" w:eastAsia="en-IN"/>
         </w:rPr>
@@ -592,7 +592,7 @@
         <w:jc w:val="center"/>
         <w:rPr>
           <w:b/>
-          <w:color w:val="C45911" w:themeColor="accent2" w:themeShade="BF"/>
+          <w:color w:val="385623" w:themeColor="accent6" w:themeShade="80"/>
           <w:szCs w:val="24"/>
         </w:rPr>
       </w:pPr>
@@ -600,7 +600,7 @@
         <w:rPr>
           <w:b/>
           <w:noProof/>
-          <w:color w:val="C45911" w:themeColor="accent2" w:themeShade="BF"/>
+          <w:color w:val="385623" w:themeColor="accent6" w:themeShade="80"/>
           <w:sz w:val="32"/>
           <w:lang w:eastAsia="en-IN"/>
         </w:rPr>
@@ -610,7 +610,7 @@
         <w:rPr>
           <w:b/>
           <w:noProof/>
-          <w:color w:val="C45911" w:themeColor="accent2" w:themeShade="BF"/>
+          <w:color w:val="385623" w:themeColor="accent6" w:themeShade="80"/>
           <w:sz w:val="32"/>
           <w:lang w:eastAsia="en-IN"/>
         </w:rPr>

</xml_diff>

<commit_message>
WEEK 9: add explanatory paragraphs under every output figure
Each Output Snapshots cell now carries the terminal capture, an italic bold
figure caption, and a short paragraph describing what the capture shows,
matching the Week 8 and Week 10 records. Page numbers re-measured after the
extra text: 18->131, 19->134, 20->137, 21->140.
</commit_message>
<xml_diff>
--- a/WEEK 9/Week9_Programs_18_21.docx
+++ b/WEEK 9/Week9_Programs_18_21.docx
@@ -15,7 +15,6 @@
     </w:p>
     <w:p>
       <w:pPr>
-        <w:spacing w:before="0" w:after="0" w:line="240" w:lineRule="auto"/>
         <w:jc w:val="center"/>
         <w:rPr>
           <w:b/>
@@ -36,7 +35,6 @@
     </w:p>
     <w:p>
       <w:pPr>
-        <w:spacing w:before="0" w:after="0" w:line="240" w:lineRule="auto"/>
         <w:jc w:val="center"/>
         <w:rPr>
           <w:b/>
@@ -59,7 +57,6 @@
     </w:p>
     <w:p>
       <w:pPr>
-        <w:spacing w:before="0" w:after="0" w:line="240" w:lineRule="auto"/>
         <w:jc w:val="center"/>
         <w:rPr>
           <w:b/>
@@ -82,7 +79,6 @@
     </w:p>
     <w:p>
       <w:pPr>
-        <w:spacing w:before="0" w:after="0" w:line="240" w:lineRule="auto"/>
         <w:jc w:val="center"/>
         <w:rPr>
           <w:b/>
@@ -115,7 +111,6 @@
     </w:p>
     <w:p>
       <w:pPr>
-        <w:spacing w:before="0" w:after="0" w:line="240" w:lineRule="auto"/>
         <w:jc w:val="center"/>
         <w:rPr>
           <w:b/>
@@ -163,7 +158,6 @@
     </w:p>
     <w:p>
       <w:pPr>
-        <w:spacing w:before="0" w:after="0" w:line="240" w:lineRule="auto"/>
         <w:jc w:val="center"/>
         <w:rPr>
           <w:b/>
@@ -176,7 +170,6 @@
     </w:p>
     <w:p>
       <w:pPr>
-        <w:spacing w:before="0" w:after="0" w:line="240" w:lineRule="auto"/>
         <w:jc w:val="center"/>
         <w:rPr>
           <w:b/>
@@ -189,7 +182,6 @@
     </w:p>
     <w:p>
       <w:pPr>
-        <w:spacing w:before="0" w:after="0" w:line="240" w:lineRule="auto"/>
         <w:jc w:val="center"/>
         <w:rPr>
           <w:b/>
@@ -202,7 +194,6 @@
     </w:p>
     <w:p>
       <w:pPr>
-        <w:spacing w:before="0" w:after="0" w:line="240" w:lineRule="auto"/>
         <w:jc w:val="center"/>
         <w:rPr>
           <w:b/>
@@ -225,7 +216,6 @@
     </w:p>
     <w:p>
       <w:pPr>
-        <w:spacing w:before="0" w:after="0" w:line="240" w:lineRule="auto"/>
         <w:jc w:val="center"/>
         <w:rPr>
           <w:b/>
@@ -238,7 +228,6 @@
     </w:p>
     <w:p>
       <w:pPr>
-        <w:spacing w:before="0" w:after="0" w:line="240" w:lineRule="auto"/>
         <w:ind w:left="-567"/>
         <w:rPr>
           <w:noProof/>
@@ -250,7 +239,6 @@
         <w:rPr>
           <w:noProof/>
           <w:color w:val="C45911" w:themeColor="accent2" w:themeShade="BF"/>
-          <w:sz w:val="4"/>
           <w:lang w:eastAsia="en-IN"/>
         </w:rPr>
         <w:drawing>
@@ -270,7 +258,6 @@
     </w:p>
     <w:p>
       <w:pPr>
-        <w:spacing w:before="0" w:after="0" w:line="240" w:lineRule="auto"/>
         <w:jc w:val="center"/>
         <w:rPr>
           <w:noProof/>
@@ -282,7 +269,6 @@
         <w:rPr>
           <w:noProof/>
           <w:color w:val="C45911" w:themeColor="accent2" w:themeShade="BF"/>
-          <w:sz w:val="4"/>
           <w:lang w:eastAsia="en-IN"/>
         </w:rPr>
         <w:t xml:space="preserve">            </w:t>
@@ -290,7 +276,6 @@
     </w:p>
     <w:p>
       <w:pPr>
-        <w:spacing w:before="0" w:after="0" w:line="240" w:lineRule="auto"/>
         <w:jc w:val="center"/>
         <w:rPr>
           <w:b/>
@@ -305,7 +290,7 @@
           <w:b/>
           <w:noProof/>
           <w:color w:val="C45911" w:themeColor="accent2" w:themeShade="BF"/>
-          <w:sz w:val="4"/>
+          <w:sz w:val="32"/>
           <w:lang w:eastAsia="en-IN"/>
         </w:rPr>
         <w:t xml:space="preserve"> </w:t>
@@ -313,7 +298,6 @@
     </w:p>
     <w:p>
       <w:pPr>
-        <w:spacing w:before="0" w:after="0" w:line="240" w:lineRule="auto"/>
         <w:jc w:val="center"/>
         <w:rPr>
           <w:b/>
@@ -326,7 +310,6 @@
     </w:p>
     <w:p>
       <w:pPr>
-        <w:spacing w:before="0" w:after="0" w:line="240" w:lineRule="auto"/>
         <w:jc w:val="center"/>
         <w:rPr>
           <w:b/>
@@ -349,7 +332,6 @@
     </w:p>
     <w:p>
       <w:pPr>
-        <w:spacing w:before="0" w:after="0" w:line="240" w:lineRule="auto"/>
         <w:jc w:val="center"/>
         <w:rPr>
           <w:b/>
@@ -361,7 +343,6 @@
     </w:p>
     <w:p>
       <w:pPr>
-        <w:spacing w:before="0" w:after="0" w:line="240" w:lineRule="auto"/>
         <w:ind w:left="-567"/>
         <w:rPr>
           <w:noProof/>
@@ -373,7 +354,6 @@
         <w:rPr>
           <w:noProof/>
           <w:color w:val="C45911" w:themeColor="accent2" w:themeShade="BF"/>
-          <w:sz w:val="4"/>
           <w:lang w:eastAsia="en-IN"/>
         </w:rPr>
         <w:drawing>
@@ -393,7 +373,6 @@
     </w:p>
     <w:p>
       <w:pPr>
-        <w:spacing w:before="0" w:after="0" w:line="240" w:lineRule="auto"/>
         <w:ind w:firstLine="720"/>
         <w:rPr>
           <w:noProof/>
@@ -404,7 +383,6 @@
     </w:p>
     <w:p>
       <w:pPr>
-        <w:spacing w:before="0" w:after="0" w:line="240" w:lineRule="auto"/>
         <w:jc w:val="center"/>
         <w:rPr>
           <w:b/>
@@ -418,7 +396,6 @@
     </w:p>
     <w:p>
       <w:pPr>
-        <w:spacing w:before="0" w:after="0" w:line="240" w:lineRule="auto"/>
         <w:jc w:val="center"/>
         <w:rPr>
           <w:b/>
@@ -432,7 +409,6 @@
     </w:p>
     <w:p>
       <w:pPr>
-        <w:spacing w:before="0" w:after="0" w:line="240" w:lineRule="auto"/>
         <w:jc w:val="center"/>
         <w:rPr>
           <w:b/>
@@ -446,7 +422,6 @@
     </w:p>
     <w:p>
       <w:pPr>
-        <w:spacing w:before="0" w:after="0" w:line="240" w:lineRule="auto"/>
         <w:jc w:val="center"/>
         <w:rPr>
           <w:b/>
@@ -460,7 +435,6 @@
     </w:p>
     <w:p>
       <w:pPr>
-        <w:spacing w:before="0" w:after="0" w:line="240" w:lineRule="auto"/>
         <w:jc w:val="center"/>
       </w:pPr>
       <w:r>
@@ -474,7 +448,6 @@
     </w:p>
     <w:p>
       <w:pPr>
-        <w:spacing w:before="0" w:after="0" w:line="240" w:lineRule="auto"/>
         <w:jc w:val="center"/>
         <w:rPr>
           <w:noProof/>
@@ -588,7 +561,6 @@
     </w:p>
     <w:p>
       <w:pPr>
-        <w:spacing w:before="0" w:after="0" w:line="240" w:lineRule="auto"/>
         <w:jc w:val="center"/>
         <w:rPr>
           <w:b/>
@@ -4554,7 +4526,7 @@
                 <w:b w:val="0"/>
                 <w:sz w:val="15"/>
               </w:rPr>
-              <w:t>133</w:t>
+              <w:t>134</w:t>
             </w:r>
           </w:p>
         </w:tc>
@@ -4720,7 +4692,7 @@
                 <w:b w:val="0"/>
                 <w:sz w:val="15"/>
               </w:rPr>
-              <w:t>135</w:t>
+              <w:t>137</w:t>
             </w:r>
           </w:p>
         </w:tc>
@@ -4894,7 +4866,7 @@
                 <w:b w:val="0"/>
                 <w:sz w:val="15"/>
               </w:rPr>
-              <w:t>138</w:t>
+              <w:t>140</w:t>
             </w:r>
           </w:p>
         </w:tc>
@@ -7480,7 +7452,7 @@
           </w:p>
           <w:p>
             <w:pPr>
-              <w:spacing w:before="40" w:after="60"/>
+              <w:spacing w:before="40" w:after="40"/>
               <w:jc w:val="center"/>
             </w:pPr>
             <w:r>
@@ -7491,6 +7463,19 @@
                 <w:sz w:val="17"/>
               </w:rPr>
               <w:t>Fig. 1.1: Terminal execution showing creation of the integer array, its length and the sum returned by the user-defined function. The string array is concatenated using mkString().</w:t>
+            </w:r>
+          </w:p>
+          <w:p>
+            <w:pPr>
+              <w:spacing w:before="20" w:after="60"/>
+              <w:jc w:val="both"/>
+            </w:pPr>
+            <w:r>
+              <w:rPr>
+                <w:rFonts w:ascii="Times New Roman" w:hAnsi="Times New Roman"/>
+                <w:sz w:val="17"/>
+              </w:rPr>
+              <w:t>The integer array is printed first with its length, and the user-defined function returns the sum 50, which the next line confirms against the manually calculated value. The string array is joined with mkString so the five fruit names appear as one comma-separated line.</w:t>
             </w:r>
           </w:p>
         </w:tc>
@@ -7566,7 +7551,7 @@
           </w:p>
           <w:p>
             <w:pPr>
-              <w:spacing w:before="40" w:after="60"/>
+              <w:spacing w:before="40" w:after="40"/>
               <w:jc w:val="center"/>
             </w:pPr>
             <w:r>
@@ -7577,6 +7562,19 @@
                 <w:sz w:val="17"/>
               </w:rPr>
               <w:t>Fig. 1.2: Index-based traversal printing every element of the integer array, followed by the verification line confirming that the function result matches the manual sum.</w:t>
+            </w:r>
+          </w:p>
+          <w:p>
+            <w:pPr>
+              <w:spacing w:before="20" w:after="60"/>
+              <w:jc w:val="both"/>
+            </w:pPr>
+            <w:r>
+              <w:rPr>
+                <w:rFonts w:ascii="Times New Roman" w:hAnsi="Times New Roman"/>
+                <w:sz w:val="17"/>
+              </w:rPr>
+              <w:t>The index loop walks the array from position 0 to 4 and prints each element beside its index, which shows that a Scala array is addressable by position. The final verification line reports that the manual sum and the function result are equal.</w:t>
             </w:r>
           </w:p>
         </w:tc>
@@ -10310,7 +10308,7 @@
           </w:p>
           <w:p>
             <w:pPr>
-              <w:spacing w:before="40" w:after="60"/>
+              <w:spacing w:before="40" w:after="40"/>
               <w:jc w:val="center"/>
             </w:pPr>
             <w:r>
@@ -10321,6 +10319,19 @@
                 <w:sz w:val="17"/>
               </w:rPr>
               <w:t>Fig. 2.1: Terminal execution showing the list of prime numbers, the squared list produced by the user-defined function and the sum of the squares.</w:t>
+            </w:r>
+          </w:p>
+          <w:p>
+            <w:pPr>
+              <w:spacing w:before="20" w:after="60"/>
+              <w:jc w:val="both"/>
+            </w:pPr>
+            <w:r>
+              <w:rPr>
+                <w:rFonts w:ascii="Times New Roman" w:hAnsi="Times New Roman"/>
+                <w:sz w:val="17"/>
+              </w:rPr>
+              <w:t>The list of five primes is printed, followed by the squared list produced by the mapping function and the sum of those squares, so the transformation applied to every element is visible in one place.</w:t>
             </w:r>
           </w:p>
         </w:tc>
@@ -10396,7 +10407,7 @@
           </w:p>
           <w:p>
             <w:pPr>
-              <w:spacing w:before="40" w:after="60"/>
+              <w:spacing w:before="40" w:after="40"/>
               <w:jc w:val="center"/>
             </w:pPr>
             <w:r>
@@ -10407,6 +10418,19 @@
                 <w:sz w:val="17"/>
               </w:rPr>
               <w:t>Fig. 2.2: Unique characters extracted from the string, the vowel intersection and the three components of the tuple printed individually.</w:t>
+            </w:r>
+          </w:p>
+          <w:p>
+            <w:pPr>
+              <w:spacing w:before="20" w:after="60"/>
+              <w:jc w:val="both"/>
+            </w:pPr>
+            <w:r>
+              <w:rPr>
+                <w:rFonts w:ascii="Times New Roman" w:hAnsi="Times New Roman"/>
+                <w:sz w:val="17"/>
+              </w:rPr>
+              <w:t>Converting the string to a set removes the repeated letters and leaves eight unique characters. Intersecting that set with the vowel set returns only e and o, and the tuple is then printed whole before each of its three components is echoed individually.</w:t>
             </w:r>
           </w:p>
         </w:tc>
@@ -13879,7 +13903,7 @@
           </w:p>
           <w:p>
             <w:pPr>
-              <w:spacing w:before="40" w:after="60"/>
+              <w:spacing w:before="40" w:after="40"/>
               <w:jc w:val="center"/>
             </w:pPr>
             <w:r>
@@ -13890,6 +13914,19 @@
                 <w:sz w:val="17"/>
               </w:rPr>
               <w:t>Fig. 3.1: Terminal execution showing the initial HashMap, insertion of new entries, the duplicate-key overwrite and the merge of two HashMaps taking the higher grade.</w:t>
+            </w:r>
+          </w:p>
+          <w:p>
+            <w:pPr>
+              <w:spacing w:before="20" w:after="60"/>
+              <w:jc w:val="both"/>
+            </w:pPr>
+            <w:r>
+              <w:rPr>
+                <w:rFonts w:ascii="Times New Roman" w:hAnsi="Times New Roman"/>
+                <w:sz w:val="17"/>
+              </w:rPr>
+              <w:t>The initial map holds three students. After the inserts the duplicate key Hasnain replaces the earlier grade of 88 with 93, which shows that a HashMap keeps one value per key. The merged map then resolves the overlapping names by keeping the higher grade.</w:t>
             </w:r>
           </w:p>
         </w:tc>
@@ -13965,7 +14002,7 @@
           </w:p>
           <w:p>
             <w:pPr>
-              <w:spacing w:before="40" w:after="60"/>
+              <w:spacing w:before="40" w:after="40"/>
               <w:jc w:val="center"/>
             </w:pPr>
             <w:r>
@@ -13976,6 +14013,19 @@
                 <w:sz w:val="17"/>
               </w:rPr>
               <w:t>Fig. 3.2: Bucket assignment produced by the hash function and the non-empty buckets showing separate chaining for colliding keys.</w:t>
+            </w:r>
+          </w:p>
+          <w:p>
+            <w:pPr>
+              <w:spacing w:before="20" w:after="60"/>
+              <w:jc w:val="both"/>
+            </w:pPr>
+            <w:r>
+              <w:rPr>
+                <w:rFonts w:ascii="Times New Roman" w:hAnsi="Times New Roman"/>
+                <w:sz w:val="17"/>
+              </w:rPr>
+              <w:t>The hash function assigns every name to one of four buckets, and two pairs of names land in the same bucket. The bucket table printed underneath lists both entries in each of those chains, so no record is lost even though two keys share an index.</w:t>
             </w:r>
           </w:p>
         </w:tc>
@@ -16785,7 +16835,7 @@
           </w:p>
           <w:p>
             <w:pPr>
-              <w:spacing w:before="40" w:after="60"/>
+              <w:spacing w:before="40" w:after="40"/>
               <w:jc w:val="center"/>
             </w:pPr>
             <w:r>
@@ -16796,6 +16846,19 @@
                 <w:sz w:val="17"/>
               </w:rPr>
               <w:t>Fig. 4.1: Terminal execution showing the source list, the filtered even numbers, the tripled list and the flatMap pairs generated from the input list.</w:t>
+            </w:r>
+          </w:p>
+          <w:p>
+            <w:pPr>
+              <w:spacing w:before="20" w:after="60"/>
+              <w:jc w:val="both"/>
+            </w:pPr>
+            <w:r>
+              <w:rPr>
+                <w:rFonts w:ascii="Times New Roman" w:hAnsi="Times New Roman"/>
+                <w:sz w:val="17"/>
+              </w:rPr>
+              <w:t>The source list 1 to 10 is shown, followed by the five even numbers returned by filter and the ten tripled values returned by map. The flatMap block pairs every integer with its square and flattens the pairs into a single list.</w:t>
             </w:r>
           </w:p>
         </w:tc>
@@ -16871,7 +16934,7 @@
           </w:p>
           <w:p>
             <w:pPr>
-              <w:spacing w:before="40" w:after="60"/>
+              <w:spacing w:before="40" w:after="40"/>
               <w:jc w:val="center"/>
             </w:pPr>
             <w:r>
@@ -16882,6 +16945,19 @@
                 <w:sz w:val="17"/>
               </w:rPr>
               <w:t>Fig. 4.2: foldLeft product with its verification against the built-in product, the combined pipeline result and the summary of combinator outputs.</w:t>
+            </w:r>
+          </w:p>
+          <w:p>
+            <w:pPr>
+              <w:spacing w:before="20" w:after="60"/>
+              <w:jc w:val="both"/>
+            </w:pPr>
+            <w:r>
+              <w:rPr>
+                <w:rFonts w:ascii="Times New Roman" w:hAnsi="Times New Roman"/>
+                <w:sz w:val="17"/>
+              </w:rPr>
+              <w:t>foldLeft reduces the list to 3628800, and the verification line confirms that this equals the built-in product of 1 to 10. The combined pipeline then applies filter, map and foldLeft in one expression to give 90, and the summary counts how many elements each combinator produced.</w:t>
             </w:r>
           </w:p>
         </w:tc>

</xml_diff>

<commit_message>
WEEK 9/10: restore the green page background from the template
The record was printing on white. The template ships
<w:background w:color=E2EFD9/> and the earlier build stripped it to avoid
a green cast. That was the wrong call: the reference record has the green page
background with peach label cells and green content cells, all on E2EFD9.

restore_background.py re-applies the background and ensures
displayBackgroundShape is present in settings.xml so LibreOffice paints it.
Both records now sample as margin E2EFD9, label F7CAAC, content E2EFD9.
</commit_message>
<xml_diff>
--- a/WEEK 9/Week9_Programs_18_21.docx
+++ b/WEEK 9/Week9_Programs_18_21.docx
@@ -1,6 +1,7 @@
 
 <file path=word/document.xml><?xml version="1.0" encoding="utf-8"?>
 <w:document xmlns:wpc="http://schemas.microsoft.com/office/word/2010/wordprocessingCanvas" xmlns:mc="http://schemas.openxmlformats.org/markup-compatibility/2006" xmlns:o="urn:schemas-microsoft-com:office:office" xmlns:r="http://schemas.openxmlformats.org/officeDocument/2006/relationships" xmlns:m="http://schemas.openxmlformats.org/officeDocument/2006/math" xmlns:v="urn:schemas-microsoft-com:vml" xmlns:wp14="http://schemas.microsoft.com/office/word/2010/wordprocessingDrawing" xmlns:wp="http://schemas.openxmlformats.org/drawingml/2006/wordprocessingDrawing" xmlns:w10="urn:schemas-microsoft-com:office:word" xmlns:w="http://schemas.openxmlformats.org/wordprocessingml/2006/main" xmlns:w14="http://schemas.microsoft.com/office/word/2010/wordml" xmlns:w15="http://schemas.microsoft.com/office/word/2012/wordml" xmlns:wpg="http://schemas.microsoft.com/office/word/2010/wordprocessingGroup" xmlns:wpi="http://schemas.microsoft.com/office/word/2010/wordprocessingInk" xmlns:wne="http://schemas.microsoft.com/office/word/2006/wordml" xmlns:wps="http://schemas.microsoft.com/office/word/2010/wordprocessingShape" mc:Ignorable="w14 w15 wp14">
+  <w:background w:color="E2EFD9"/>
   <w:body>
     <w:p>
       <w:pPr>
@@ -5004,7 +5005,7 @@
           <w:tcPr>
             <w:tcW w:type="dxa" w:w="7375"/>
             <w:gridSpan w:val="5"/>
-            <w:shd w:val="clear" w:color="auto" w:fill="FFFFFF"/>
+            <w:shd w:val="clear" w:color="auto" w:fill="E2EFD9"/>
           </w:tcPr>
           <w:p>
             <w:pPr>
@@ -5050,7 +5051,7 @@
           <w:tcPr>
             <w:tcW w:type="dxa" w:w="7375"/>
             <w:gridSpan w:val="5"/>
-            <w:shd w:val="clear" w:color="auto" w:fill="FFFFFF"/>
+            <w:shd w:val="clear" w:color="auto" w:fill="E2EFD9"/>
           </w:tcPr>
           <w:p>
             <w:pPr>
@@ -5152,7 +5153,7 @@
           <w:tcPr>
             <w:tcW w:type="dxa" w:w="7375"/>
             <w:gridSpan w:val="5"/>
-            <w:shd w:val="clear" w:color="auto" w:fill="FFFFFF"/>
+            <w:shd w:val="clear" w:color="auto" w:fill="E2EFD9"/>
           </w:tcPr>
           <w:p>
             <w:pPr>
@@ -5309,7 +5310,7 @@
         <w:tc>
           <w:tcPr>
             <w:tcW w:type="dxa" w:w="708"/>
-            <w:shd w:val="clear" w:color="auto" w:fill="FFFFFF"/>
+            <w:shd w:val="clear" w:color="auto" w:fill="E2EFD9"/>
             <w:vAlign w:val="center"/>
           </w:tcPr>
           <w:p>
@@ -5331,7 +5332,7 @@
         <w:tc>
           <w:tcPr>
             <w:tcW w:type="dxa" w:w="1560"/>
-            <w:shd w:val="clear" w:color="auto" w:fill="FFFFFF"/>
+            <w:shd w:val="clear" w:color="auto" w:fill="E2EFD9"/>
           </w:tcPr>
           <w:p>
             <w:pPr>
@@ -5353,7 +5354,7 @@
         <w:tc>
           <w:tcPr>
             <w:tcW w:type="dxa" w:w="1048"/>
-            <w:shd w:val="clear" w:color="auto" w:fill="FFFFFF"/>
+            <w:shd w:val="clear" w:color="auto" w:fill="E2EFD9"/>
           </w:tcPr>
           <w:p>
             <w:pPr>
@@ -5375,7 +5376,7 @@
           <w:tcPr>
             <w:tcW w:type="dxa" w:w="4059"/>
             <w:gridSpan w:val="2"/>
-            <w:shd w:val="clear" w:color="auto" w:fill="FFFFFF"/>
+            <w:shd w:val="clear" w:color="auto" w:fill="E2EFD9"/>
           </w:tcPr>
           <w:p>
             <w:pPr>
@@ -5418,7 +5419,7 @@
         <w:tc>
           <w:tcPr>
             <w:tcW w:type="dxa" w:w="708"/>
-            <w:shd w:val="clear" w:color="auto" w:fill="FFFFFF"/>
+            <w:shd w:val="clear" w:color="auto" w:fill="E2EFD9"/>
             <w:vAlign w:val="center"/>
           </w:tcPr>
           <w:p>
@@ -5440,7 +5441,7 @@
         <w:tc>
           <w:tcPr>
             <w:tcW w:type="dxa" w:w="1560"/>
-            <w:shd w:val="clear" w:color="auto" w:fill="FFFFFF"/>
+            <w:shd w:val="clear" w:color="auto" w:fill="E2EFD9"/>
           </w:tcPr>
           <w:p>
             <w:pPr>
@@ -5462,7 +5463,7 @@
         <w:tc>
           <w:tcPr>
             <w:tcW w:type="dxa" w:w="1048"/>
-            <w:shd w:val="clear" w:color="auto" w:fill="FFFFFF"/>
+            <w:shd w:val="clear" w:color="auto" w:fill="E2EFD9"/>
           </w:tcPr>
           <w:p>
             <w:pPr>
@@ -5484,7 +5485,7 @@
           <w:tcPr>
             <w:tcW w:type="dxa" w:w="4059"/>
             <w:gridSpan w:val="2"/>
-            <w:shd w:val="clear" w:color="auto" w:fill="FFFFFF"/>
+            <w:shd w:val="clear" w:color="auto" w:fill="E2EFD9"/>
           </w:tcPr>
           <w:p>
             <w:pPr>
@@ -5527,7 +5528,7 @@
         <w:tc>
           <w:tcPr>
             <w:tcW w:type="dxa" w:w="708"/>
-            <w:shd w:val="clear" w:color="auto" w:fill="FFFFFF"/>
+            <w:shd w:val="clear" w:color="auto" w:fill="E2EFD9"/>
             <w:vAlign w:val="center"/>
           </w:tcPr>
           <w:p>
@@ -5549,7 +5550,7 @@
         <w:tc>
           <w:tcPr>
             <w:tcW w:type="dxa" w:w="1560"/>
-            <w:shd w:val="clear" w:color="auto" w:fill="FFFFFF"/>
+            <w:shd w:val="clear" w:color="auto" w:fill="E2EFD9"/>
           </w:tcPr>
           <w:p>
             <w:pPr>
@@ -5571,7 +5572,7 @@
         <w:tc>
           <w:tcPr>
             <w:tcW w:type="dxa" w:w="1048"/>
-            <w:shd w:val="clear" w:color="auto" w:fill="FFFFFF"/>
+            <w:shd w:val="clear" w:color="auto" w:fill="E2EFD9"/>
           </w:tcPr>
           <w:p>
             <w:pPr>
@@ -5593,7 +5594,7 @@
           <w:tcPr>
             <w:tcW w:type="dxa" w:w="4059"/>
             <w:gridSpan w:val="2"/>
-            <w:shd w:val="clear" w:color="auto" w:fill="FFFFFF"/>
+            <w:shd w:val="clear" w:color="auto" w:fill="E2EFD9"/>
           </w:tcPr>
           <w:p>
             <w:pPr>
@@ -5636,7 +5637,7 @@
         <w:tc>
           <w:tcPr>
             <w:tcW w:type="dxa" w:w="708"/>
-            <w:shd w:val="clear" w:color="auto" w:fill="FFFFFF"/>
+            <w:shd w:val="clear" w:color="auto" w:fill="E2EFD9"/>
             <w:vAlign w:val="center"/>
           </w:tcPr>
           <w:p>
@@ -5658,7 +5659,7 @@
         <w:tc>
           <w:tcPr>
             <w:tcW w:type="dxa" w:w="1560"/>
-            <w:shd w:val="clear" w:color="auto" w:fill="FFFFFF"/>
+            <w:shd w:val="clear" w:color="auto" w:fill="E2EFD9"/>
           </w:tcPr>
           <w:p>
             <w:pPr>
@@ -5680,7 +5681,7 @@
         <w:tc>
           <w:tcPr>
             <w:tcW w:type="dxa" w:w="1048"/>
-            <w:shd w:val="clear" w:color="auto" w:fill="FFFFFF"/>
+            <w:shd w:val="clear" w:color="auto" w:fill="E2EFD9"/>
           </w:tcPr>
           <w:p>
             <w:pPr>
@@ -5702,7 +5703,7 @@
           <w:tcPr>
             <w:tcW w:type="dxa" w:w="4059"/>
             <w:gridSpan w:val="2"/>
-            <w:shd w:val="clear" w:color="auto" w:fill="FFFFFF"/>
+            <w:shd w:val="clear" w:color="auto" w:fill="E2EFD9"/>
           </w:tcPr>
           <w:p>
             <w:pPr>
@@ -5745,7 +5746,7 @@
         <w:tc>
           <w:tcPr>
             <w:tcW w:type="dxa" w:w="708"/>
-            <w:shd w:val="clear" w:color="auto" w:fill="FFFFFF"/>
+            <w:shd w:val="clear" w:color="auto" w:fill="E2EFD9"/>
             <w:vAlign w:val="center"/>
           </w:tcPr>
           <w:p>
@@ -5767,7 +5768,7 @@
         <w:tc>
           <w:tcPr>
             <w:tcW w:type="dxa" w:w="1560"/>
-            <w:shd w:val="clear" w:color="auto" w:fill="FFFFFF"/>
+            <w:shd w:val="clear" w:color="auto" w:fill="E2EFD9"/>
           </w:tcPr>
           <w:p>
             <w:pPr>
@@ -5789,7 +5790,7 @@
         <w:tc>
           <w:tcPr>
             <w:tcW w:type="dxa" w:w="1048"/>
-            <w:shd w:val="clear" w:color="auto" w:fill="FFFFFF"/>
+            <w:shd w:val="clear" w:color="auto" w:fill="E2EFD9"/>
           </w:tcPr>
           <w:p>
             <w:pPr>
@@ -5811,7 +5812,7 @@
           <w:tcPr>
             <w:tcW w:type="dxa" w:w="4059"/>
             <w:gridSpan w:val="2"/>
-            <w:shd w:val="clear" w:color="auto" w:fill="FFFFFF"/>
+            <w:shd w:val="clear" w:color="auto" w:fill="E2EFD9"/>
           </w:tcPr>
           <w:p>
             <w:pPr>
@@ -5854,7 +5855,7 @@
         <w:tc>
           <w:tcPr>
             <w:tcW w:type="dxa" w:w="708"/>
-            <w:shd w:val="clear" w:color="auto" w:fill="FFFFFF"/>
+            <w:shd w:val="clear" w:color="auto" w:fill="E2EFD9"/>
             <w:vAlign w:val="center"/>
           </w:tcPr>
           <w:p>
@@ -5876,7 +5877,7 @@
         <w:tc>
           <w:tcPr>
             <w:tcW w:type="dxa" w:w="1560"/>
-            <w:shd w:val="clear" w:color="auto" w:fill="FFFFFF"/>
+            <w:shd w:val="clear" w:color="auto" w:fill="E2EFD9"/>
           </w:tcPr>
           <w:p>
             <w:pPr>
@@ -5898,7 +5899,7 @@
         <w:tc>
           <w:tcPr>
             <w:tcW w:type="dxa" w:w="1048"/>
-            <w:shd w:val="clear" w:color="auto" w:fill="FFFFFF"/>
+            <w:shd w:val="clear" w:color="auto" w:fill="E2EFD9"/>
           </w:tcPr>
           <w:p>
             <w:pPr>
@@ -5920,7 +5921,7 @@
           <w:tcPr>
             <w:tcW w:type="dxa" w:w="4059"/>
             <w:gridSpan w:val="2"/>
-            <w:shd w:val="clear" w:color="auto" w:fill="FFFFFF"/>
+            <w:shd w:val="clear" w:color="auto" w:fill="E2EFD9"/>
           </w:tcPr>
           <w:p>
             <w:pPr>
@@ -5963,7 +5964,7 @@
         <w:tc>
           <w:tcPr>
             <w:tcW w:type="dxa" w:w="708"/>
-            <w:shd w:val="clear" w:color="auto" w:fill="FFFFFF"/>
+            <w:shd w:val="clear" w:color="auto" w:fill="E2EFD9"/>
             <w:vAlign w:val="center"/>
           </w:tcPr>
           <w:p>
@@ -5985,7 +5986,7 @@
         <w:tc>
           <w:tcPr>
             <w:tcW w:type="dxa" w:w="1560"/>
-            <w:shd w:val="clear" w:color="auto" w:fill="FFFFFF"/>
+            <w:shd w:val="clear" w:color="auto" w:fill="E2EFD9"/>
           </w:tcPr>
           <w:p>
             <w:pPr>
@@ -6007,7 +6008,7 @@
         <w:tc>
           <w:tcPr>
             <w:tcW w:type="dxa" w:w="1048"/>
-            <w:shd w:val="clear" w:color="auto" w:fill="FFFFFF"/>
+            <w:shd w:val="clear" w:color="auto" w:fill="E2EFD9"/>
           </w:tcPr>
           <w:p>
             <w:pPr>
@@ -6029,7 +6030,7 @@
           <w:tcPr>
             <w:tcW w:type="dxa" w:w="4059"/>
             <w:gridSpan w:val="2"/>
-            <w:shd w:val="clear" w:color="auto" w:fill="FFFFFF"/>
+            <w:shd w:val="clear" w:color="auto" w:fill="E2EFD9"/>
           </w:tcPr>
           <w:p>
             <w:pPr>
@@ -6072,7 +6073,7 @@
         <w:tc>
           <w:tcPr>
             <w:tcW w:type="dxa" w:w="708"/>
-            <w:shd w:val="clear" w:color="auto" w:fill="FFFFFF"/>
+            <w:shd w:val="clear" w:color="auto" w:fill="E2EFD9"/>
             <w:vAlign w:val="center"/>
           </w:tcPr>
           <w:p>
@@ -6094,7 +6095,7 @@
         <w:tc>
           <w:tcPr>
             <w:tcW w:type="dxa" w:w="1560"/>
-            <w:shd w:val="clear" w:color="auto" w:fill="FFFFFF"/>
+            <w:shd w:val="clear" w:color="auto" w:fill="E2EFD9"/>
           </w:tcPr>
           <w:p>
             <w:pPr>
@@ -6116,7 +6117,7 @@
         <w:tc>
           <w:tcPr>
             <w:tcW w:type="dxa" w:w="1048"/>
-            <w:shd w:val="clear" w:color="auto" w:fill="FFFFFF"/>
+            <w:shd w:val="clear" w:color="auto" w:fill="E2EFD9"/>
           </w:tcPr>
           <w:p>
             <w:pPr>
@@ -6138,7 +6139,7 @@
           <w:tcPr>
             <w:tcW w:type="dxa" w:w="4059"/>
             <w:gridSpan w:val="2"/>
-            <w:shd w:val="clear" w:color="auto" w:fill="FFFFFF"/>
+            <w:shd w:val="clear" w:color="auto" w:fill="E2EFD9"/>
           </w:tcPr>
           <w:p>
             <w:pPr>
@@ -6181,7 +6182,7 @@
         <w:tc>
           <w:tcPr>
             <w:tcW w:type="dxa" w:w="708"/>
-            <w:shd w:val="clear" w:color="auto" w:fill="FFFFFF"/>
+            <w:shd w:val="clear" w:color="auto" w:fill="E2EFD9"/>
             <w:vAlign w:val="center"/>
           </w:tcPr>
           <w:p>
@@ -6203,7 +6204,7 @@
         <w:tc>
           <w:tcPr>
             <w:tcW w:type="dxa" w:w="1560"/>
-            <w:shd w:val="clear" w:color="auto" w:fill="FFFFFF"/>
+            <w:shd w:val="clear" w:color="auto" w:fill="E2EFD9"/>
           </w:tcPr>
           <w:p>
             <w:pPr>
@@ -6225,7 +6226,7 @@
         <w:tc>
           <w:tcPr>
             <w:tcW w:type="dxa" w:w="1048"/>
-            <w:shd w:val="clear" w:color="auto" w:fill="FFFFFF"/>
+            <w:shd w:val="clear" w:color="auto" w:fill="E2EFD9"/>
           </w:tcPr>
           <w:p>
             <w:pPr>
@@ -6247,7 +6248,7 @@
           <w:tcPr>
             <w:tcW w:type="dxa" w:w="4059"/>
             <w:gridSpan w:val="2"/>
-            <w:shd w:val="clear" w:color="auto" w:fill="FFFFFF"/>
+            <w:shd w:val="clear" w:color="auto" w:fill="E2EFD9"/>
           </w:tcPr>
           <w:p>
             <w:pPr>
@@ -6290,7 +6291,7 @@
         <w:tc>
           <w:tcPr>
             <w:tcW w:type="dxa" w:w="708"/>
-            <w:shd w:val="clear" w:color="auto" w:fill="FFFFFF"/>
+            <w:shd w:val="clear" w:color="auto" w:fill="E2EFD9"/>
             <w:vAlign w:val="center"/>
           </w:tcPr>
           <w:p>
@@ -6312,7 +6313,7 @@
         <w:tc>
           <w:tcPr>
             <w:tcW w:type="dxa" w:w="1560"/>
-            <w:shd w:val="clear" w:color="auto" w:fill="FFFFFF"/>
+            <w:shd w:val="clear" w:color="auto" w:fill="E2EFD9"/>
           </w:tcPr>
           <w:p>
             <w:pPr>
@@ -6334,7 +6335,7 @@
         <w:tc>
           <w:tcPr>
             <w:tcW w:type="dxa" w:w="1048"/>
-            <w:shd w:val="clear" w:color="auto" w:fill="FFFFFF"/>
+            <w:shd w:val="clear" w:color="auto" w:fill="E2EFD9"/>
           </w:tcPr>
           <w:p>
             <w:pPr>
@@ -6356,7 +6357,7 @@
           <w:tcPr>
             <w:tcW w:type="dxa" w:w="4059"/>
             <w:gridSpan w:val="2"/>
-            <w:shd w:val="clear" w:color="auto" w:fill="FFFFFF"/>
+            <w:shd w:val="clear" w:color="auto" w:fill="E2EFD9"/>
           </w:tcPr>
           <w:p>
             <w:pPr>
@@ -6399,7 +6400,7 @@
         <w:tc>
           <w:tcPr>
             <w:tcW w:type="dxa" w:w="708"/>
-            <w:shd w:val="clear" w:color="auto" w:fill="FFFFFF"/>
+            <w:shd w:val="clear" w:color="auto" w:fill="E2EFD9"/>
             <w:vAlign w:val="center"/>
           </w:tcPr>
           <w:p>
@@ -6421,7 +6422,7 @@
         <w:tc>
           <w:tcPr>
             <w:tcW w:type="dxa" w:w="1560"/>
-            <w:shd w:val="clear" w:color="auto" w:fill="FFFFFF"/>
+            <w:shd w:val="clear" w:color="auto" w:fill="E2EFD9"/>
           </w:tcPr>
           <w:p>
             <w:pPr>
@@ -6443,7 +6444,7 @@
         <w:tc>
           <w:tcPr>
             <w:tcW w:type="dxa" w:w="1048"/>
-            <w:shd w:val="clear" w:color="auto" w:fill="FFFFFF"/>
+            <w:shd w:val="clear" w:color="auto" w:fill="E2EFD9"/>
           </w:tcPr>
           <w:p>
             <w:pPr>
@@ -6465,7 +6466,7 @@
           <w:tcPr>
             <w:tcW w:type="dxa" w:w="4059"/>
             <w:gridSpan w:val="2"/>
-            <w:shd w:val="clear" w:color="auto" w:fill="FFFFFF"/>
+            <w:shd w:val="clear" w:color="auto" w:fill="E2EFD9"/>
           </w:tcPr>
           <w:p>
             <w:pPr>
@@ -6508,7 +6509,7 @@
         <w:tc>
           <w:tcPr>
             <w:tcW w:type="dxa" w:w="708"/>
-            <w:shd w:val="clear" w:color="auto" w:fill="FFFFFF"/>
+            <w:shd w:val="clear" w:color="auto" w:fill="E2EFD9"/>
             <w:vAlign w:val="center"/>
           </w:tcPr>
           <w:p>
@@ -6530,7 +6531,7 @@
         <w:tc>
           <w:tcPr>
             <w:tcW w:type="dxa" w:w="1560"/>
-            <w:shd w:val="clear" w:color="auto" w:fill="FFFFFF"/>
+            <w:shd w:val="clear" w:color="auto" w:fill="E2EFD9"/>
           </w:tcPr>
           <w:p>
             <w:pPr>
@@ -6552,7 +6553,7 @@
         <w:tc>
           <w:tcPr>
             <w:tcW w:type="dxa" w:w="1048"/>
-            <w:shd w:val="clear" w:color="auto" w:fill="FFFFFF"/>
+            <w:shd w:val="clear" w:color="auto" w:fill="E2EFD9"/>
           </w:tcPr>
           <w:p>
             <w:pPr>
@@ -6574,7 +6575,7 @@
           <w:tcPr>
             <w:tcW w:type="dxa" w:w="4059"/>
             <w:gridSpan w:val="2"/>
-            <w:shd w:val="clear" w:color="auto" w:fill="FFFFFF"/>
+            <w:shd w:val="clear" w:color="auto" w:fill="E2EFD9"/>
           </w:tcPr>
           <w:p>
             <w:pPr>
@@ -6642,7 +6643,7 @@
           <w:tcPr>
             <w:tcW w:type="dxa" w:w="7375"/>
             <w:gridSpan w:val="5"/>
-            <w:shd w:val="clear" w:color="auto" w:fill="FFFFFF"/>
+            <w:shd w:val="clear" w:color="auto" w:fill="E2EFD9"/>
           </w:tcPr>
           <w:p>
             <w:pPr>
@@ -6800,7 +6801,7 @@
           <w:tcPr>
             <w:tcW w:type="dxa" w:w="7375"/>
             <w:gridSpan w:val="5"/>
-            <w:shd w:val="clear" w:color="auto" w:fill="FFFFFF"/>
+            <w:shd w:val="clear" w:color="auto" w:fill="E2EFD9"/>
           </w:tcPr>
           <w:p>
             <w:pPr>
@@ -7413,7 +7414,7 @@
           <w:tcPr>
             <w:tcW w:type="dxa" w:w="7375"/>
             <w:gridSpan w:val="5"/>
-            <w:shd w:val="clear" w:color="auto" w:fill="FFFFFF"/>
+            <w:shd w:val="clear" w:color="auto" w:fill="E2EFD9"/>
           </w:tcPr>
           <w:p>
             <w:pPr>
@@ -7512,7 +7513,7 @@
           <w:tcPr>
             <w:tcW w:type="dxa" w:w="7375"/>
             <w:gridSpan w:val="5"/>
-            <w:shd w:val="clear" w:color="auto" w:fill="FFFFFF"/>
+            <w:shd w:val="clear" w:color="auto" w:fill="E2EFD9"/>
           </w:tcPr>
           <w:p>
             <w:pPr>
@@ -7612,7 +7613,7 @@
           <w:tcPr>
             <w:tcW w:type="dxa" w:w="7375"/>
             <w:gridSpan w:val="5"/>
-            <w:shd w:val="clear" w:color="auto" w:fill="FFFFFF"/>
+            <w:shd w:val="clear" w:color="auto" w:fill="E2EFD9"/>
           </w:tcPr>
           <w:p>
             <w:pPr>
@@ -7658,7 +7659,7 @@
           <w:tcPr>
             <w:tcW w:type="dxa" w:w="7375"/>
             <w:gridSpan w:val="5"/>
-            <w:shd w:val="clear" w:color="auto" w:fill="FFFFFF"/>
+            <w:shd w:val="clear" w:color="auto" w:fill="E2EFD9"/>
           </w:tcPr>
           <w:p>
             <w:pPr>
@@ -7860,7 +7861,7 @@
           <w:tcPr>
             <w:tcW w:type="dxa" w:w="7375"/>
             <w:gridSpan w:val="5"/>
-            <w:shd w:val="clear" w:color="auto" w:fill="FFFFFF"/>
+            <w:shd w:val="clear" w:color="auto" w:fill="E2EFD9"/>
           </w:tcPr>
           <w:p>
             <w:pPr>
@@ -7906,7 +7907,7 @@
           <w:tcPr>
             <w:tcW w:type="dxa" w:w="7375"/>
             <w:gridSpan w:val="5"/>
-            <w:shd w:val="clear" w:color="auto" w:fill="FFFFFF"/>
+            <w:shd w:val="clear" w:color="auto" w:fill="E2EFD9"/>
           </w:tcPr>
           <w:p>
             <w:pPr>
@@ -8008,7 +8009,7 @@
           <w:tcPr>
             <w:tcW w:type="dxa" w:w="7375"/>
             <w:gridSpan w:val="5"/>
-            <w:shd w:val="clear" w:color="auto" w:fill="FFFFFF"/>
+            <w:shd w:val="clear" w:color="auto" w:fill="E2EFD9"/>
           </w:tcPr>
           <w:p>
             <w:pPr>
@@ -8165,7 +8166,7 @@
         <w:tc>
           <w:tcPr>
             <w:tcW w:type="dxa" w:w="708"/>
-            <w:shd w:val="clear" w:color="auto" w:fill="FFFFFF"/>
+            <w:shd w:val="clear" w:color="auto" w:fill="E2EFD9"/>
             <w:vAlign w:val="center"/>
           </w:tcPr>
           <w:p>
@@ -8187,7 +8188,7 @@
         <w:tc>
           <w:tcPr>
             <w:tcW w:type="dxa" w:w="1560"/>
-            <w:shd w:val="clear" w:color="auto" w:fill="FFFFFF"/>
+            <w:shd w:val="clear" w:color="auto" w:fill="E2EFD9"/>
           </w:tcPr>
           <w:p>
             <w:pPr>
@@ -8209,7 +8210,7 @@
         <w:tc>
           <w:tcPr>
             <w:tcW w:type="dxa" w:w="1048"/>
-            <w:shd w:val="clear" w:color="auto" w:fill="FFFFFF"/>
+            <w:shd w:val="clear" w:color="auto" w:fill="E2EFD9"/>
           </w:tcPr>
           <w:p>
             <w:pPr>
@@ -8231,7 +8232,7 @@
           <w:tcPr>
             <w:tcW w:type="dxa" w:w="4059"/>
             <w:gridSpan w:val="2"/>
-            <w:shd w:val="clear" w:color="auto" w:fill="FFFFFF"/>
+            <w:shd w:val="clear" w:color="auto" w:fill="E2EFD9"/>
           </w:tcPr>
           <w:p>
             <w:pPr>
@@ -8274,7 +8275,7 @@
         <w:tc>
           <w:tcPr>
             <w:tcW w:type="dxa" w:w="708"/>
-            <w:shd w:val="clear" w:color="auto" w:fill="FFFFFF"/>
+            <w:shd w:val="clear" w:color="auto" w:fill="E2EFD9"/>
             <w:vAlign w:val="center"/>
           </w:tcPr>
           <w:p>
@@ -8296,7 +8297,7 @@
         <w:tc>
           <w:tcPr>
             <w:tcW w:type="dxa" w:w="1560"/>
-            <w:shd w:val="clear" w:color="auto" w:fill="FFFFFF"/>
+            <w:shd w:val="clear" w:color="auto" w:fill="E2EFD9"/>
           </w:tcPr>
           <w:p>
             <w:pPr>
@@ -8318,7 +8319,7 @@
         <w:tc>
           <w:tcPr>
             <w:tcW w:type="dxa" w:w="1048"/>
-            <w:shd w:val="clear" w:color="auto" w:fill="FFFFFF"/>
+            <w:shd w:val="clear" w:color="auto" w:fill="E2EFD9"/>
           </w:tcPr>
           <w:p>
             <w:pPr>
@@ -8340,7 +8341,7 @@
           <w:tcPr>
             <w:tcW w:type="dxa" w:w="4059"/>
             <w:gridSpan w:val="2"/>
-            <w:shd w:val="clear" w:color="auto" w:fill="FFFFFF"/>
+            <w:shd w:val="clear" w:color="auto" w:fill="E2EFD9"/>
           </w:tcPr>
           <w:p>
             <w:pPr>
@@ -8383,7 +8384,7 @@
         <w:tc>
           <w:tcPr>
             <w:tcW w:type="dxa" w:w="708"/>
-            <w:shd w:val="clear" w:color="auto" w:fill="FFFFFF"/>
+            <w:shd w:val="clear" w:color="auto" w:fill="E2EFD9"/>
             <w:vAlign w:val="center"/>
           </w:tcPr>
           <w:p>
@@ -8405,7 +8406,7 @@
         <w:tc>
           <w:tcPr>
             <w:tcW w:type="dxa" w:w="1560"/>
-            <w:shd w:val="clear" w:color="auto" w:fill="FFFFFF"/>
+            <w:shd w:val="clear" w:color="auto" w:fill="E2EFD9"/>
           </w:tcPr>
           <w:p>
             <w:pPr>
@@ -8427,7 +8428,7 @@
         <w:tc>
           <w:tcPr>
             <w:tcW w:type="dxa" w:w="1048"/>
-            <w:shd w:val="clear" w:color="auto" w:fill="FFFFFF"/>
+            <w:shd w:val="clear" w:color="auto" w:fill="E2EFD9"/>
           </w:tcPr>
           <w:p>
             <w:pPr>
@@ -8449,7 +8450,7 @@
           <w:tcPr>
             <w:tcW w:type="dxa" w:w="4059"/>
             <w:gridSpan w:val="2"/>
-            <w:shd w:val="clear" w:color="auto" w:fill="FFFFFF"/>
+            <w:shd w:val="clear" w:color="auto" w:fill="E2EFD9"/>
           </w:tcPr>
           <w:p>
             <w:pPr>
@@ -8492,7 +8493,7 @@
         <w:tc>
           <w:tcPr>
             <w:tcW w:type="dxa" w:w="708"/>
-            <w:shd w:val="clear" w:color="auto" w:fill="FFFFFF"/>
+            <w:shd w:val="clear" w:color="auto" w:fill="E2EFD9"/>
             <w:vAlign w:val="center"/>
           </w:tcPr>
           <w:p>
@@ -8514,7 +8515,7 @@
         <w:tc>
           <w:tcPr>
             <w:tcW w:type="dxa" w:w="1560"/>
-            <w:shd w:val="clear" w:color="auto" w:fill="FFFFFF"/>
+            <w:shd w:val="clear" w:color="auto" w:fill="E2EFD9"/>
           </w:tcPr>
           <w:p>
             <w:pPr>
@@ -8536,7 +8537,7 @@
         <w:tc>
           <w:tcPr>
             <w:tcW w:type="dxa" w:w="1048"/>
-            <w:shd w:val="clear" w:color="auto" w:fill="FFFFFF"/>
+            <w:shd w:val="clear" w:color="auto" w:fill="E2EFD9"/>
           </w:tcPr>
           <w:p>
             <w:pPr>
@@ -8558,7 +8559,7 @@
           <w:tcPr>
             <w:tcW w:type="dxa" w:w="4059"/>
             <w:gridSpan w:val="2"/>
-            <w:shd w:val="clear" w:color="auto" w:fill="FFFFFF"/>
+            <w:shd w:val="clear" w:color="auto" w:fill="E2EFD9"/>
           </w:tcPr>
           <w:p>
             <w:pPr>
@@ -8601,7 +8602,7 @@
         <w:tc>
           <w:tcPr>
             <w:tcW w:type="dxa" w:w="708"/>
-            <w:shd w:val="clear" w:color="auto" w:fill="FFFFFF"/>
+            <w:shd w:val="clear" w:color="auto" w:fill="E2EFD9"/>
             <w:vAlign w:val="center"/>
           </w:tcPr>
           <w:p>
@@ -8623,7 +8624,7 @@
         <w:tc>
           <w:tcPr>
             <w:tcW w:type="dxa" w:w="1560"/>
-            <w:shd w:val="clear" w:color="auto" w:fill="FFFFFF"/>
+            <w:shd w:val="clear" w:color="auto" w:fill="E2EFD9"/>
           </w:tcPr>
           <w:p>
             <w:pPr>
@@ -8645,7 +8646,7 @@
         <w:tc>
           <w:tcPr>
             <w:tcW w:type="dxa" w:w="1048"/>
-            <w:shd w:val="clear" w:color="auto" w:fill="FFFFFF"/>
+            <w:shd w:val="clear" w:color="auto" w:fill="E2EFD9"/>
           </w:tcPr>
           <w:p>
             <w:pPr>
@@ -8667,7 +8668,7 @@
           <w:tcPr>
             <w:tcW w:type="dxa" w:w="4059"/>
             <w:gridSpan w:val="2"/>
-            <w:shd w:val="clear" w:color="auto" w:fill="FFFFFF"/>
+            <w:shd w:val="clear" w:color="auto" w:fill="E2EFD9"/>
           </w:tcPr>
           <w:p>
             <w:pPr>
@@ -8710,7 +8711,7 @@
         <w:tc>
           <w:tcPr>
             <w:tcW w:type="dxa" w:w="708"/>
-            <w:shd w:val="clear" w:color="auto" w:fill="FFFFFF"/>
+            <w:shd w:val="clear" w:color="auto" w:fill="E2EFD9"/>
             <w:vAlign w:val="center"/>
           </w:tcPr>
           <w:p>
@@ -8732,7 +8733,7 @@
         <w:tc>
           <w:tcPr>
             <w:tcW w:type="dxa" w:w="1560"/>
-            <w:shd w:val="clear" w:color="auto" w:fill="FFFFFF"/>
+            <w:shd w:val="clear" w:color="auto" w:fill="E2EFD9"/>
           </w:tcPr>
           <w:p>
             <w:pPr>
@@ -8754,7 +8755,7 @@
         <w:tc>
           <w:tcPr>
             <w:tcW w:type="dxa" w:w="1048"/>
-            <w:shd w:val="clear" w:color="auto" w:fill="FFFFFF"/>
+            <w:shd w:val="clear" w:color="auto" w:fill="E2EFD9"/>
           </w:tcPr>
           <w:p>
             <w:pPr>
@@ -8776,7 +8777,7 @@
           <w:tcPr>
             <w:tcW w:type="dxa" w:w="4059"/>
             <w:gridSpan w:val="2"/>
-            <w:shd w:val="clear" w:color="auto" w:fill="FFFFFF"/>
+            <w:shd w:val="clear" w:color="auto" w:fill="E2EFD9"/>
           </w:tcPr>
           <w:p>
             <w:pPr>
@@ -8819,7 +8820,7 @@
         <w:tc>
           <w:tcPr>
             <w:tcW w:type="dxa" w:w="708"/>
-            <w:shd w:val="clear" w:color="auto" w:fill="FFFFFF"/>
+            <w:shd w:val="clear" w:color="auto" w:fill="E2EFD9"/>
             <w:vAlign w:val="center"/>
           </w:tcPr>
           <w:p>
@@ -8841,7 +8842,7 @@
         <w:tc>
           <w:tcPr>
             <w:tcW w:type="dxa" w:w="1560"/>
-            <w:shd w:val="clear" w:color="auto" w:fill="FFFFFF"/>
+            <w:shd w:val="clear" w:color="auto" w:fill="E2EFD9"/>
           </w:tcPr>
           <w:p>
             <w:pPr>
@@ -8863,7 +8864,7 @@
         <w:tc>
           <w:tcPr>
             <w:tcW w:type="dxa" w:w="1048"/>
-            <w:shd w:val="clear" w:color="auto" w:fill="FFFFFF"/>
+            <w:shd w:val="clear" w:color="auto" w:fill="E2EFD9"/>
           </w:tcPr>
           <w:p>
             <w:pPr>
@@ -8885,7 +8886,7 @@
           <w:tcPr>
             <w:tcW w:type="dxa" w:w="4059"/>
             <w:gridSpan w:val="2"/>
-            <w:shd w:val="clear" w:color="auto" w:fill="FFFFFF"/>
+            <w:shd w:val="clear" w:color="auto" w:fill="E2EFD9"/>
           </w:tcPr>
           <w:p>
             <w:pPr>
@@ -8928,7 +8929,7 @@
         <w:tc>
           <w:tcPr>
             <w:tcW w:type="dxa" w:w="708"/>
-            <w:shd w:val="clear" w:color="auto" w:fill="FFFFFF"/>
+            <w:shd w:val="clear" w:color="auto" w:fill="E2EFD9"/>
             <w:vAlign w:val="center"/>
           </w:tcPr>
           <w:p>
@@ -8950,7 +8951,7 @@
         <w:tc>
           <w:tcPr>
             <w:tcW w:type="dxa" w:w="1560"/>
-            <w:shd w:val="clear" w:color="auto" w:fill="FFFFFF"/>
+            <w:shd w:val="clear" w:color="auto" w:fill="E2EFD9"/>
           </w:tcPr>
           <w:p>
             <w:pPr>
@@ -8972,7 +8973,7 @@
         <w:tc>
           <w:tcPr>
             <w:tcW w:type="dxa" w:w="1048"/>
-            <w:shd w:val="clear" w:color="auto" w:fill="FFFFFF"/>
+            <w:shd w:val="clear" w:color="auto" w:fill="E2EFD9"/>
           </w:tcPr>
           <w:p>
             <w:pPr>
@@ -8994,7 +8995,7 @@
           <w:tcPr>
             <w:tcW w:type="dxa" w:w="4059"/>
             <w:gridSpan w:val="2"/>
-            <w:shd w:val="clear" w:color="auto" w:fill="FFFFFF"/>
+            <w:shd w:val="clear" w:color="auto" w:fill="E2EFD9"/>
           </w:tcPr>
           <w:p>
             <w:pPr>
@@ -9037,7 +9038,7 @@
         <w:tc>
           <w:tcPr>
             <w:tcW w:type="dxa" w:w="708"/>
-            <w:shd w:val="clear" w:color="auto" w:fill="FFFFFF"/>
+            <w:shd w:val="clear" w:color="auto" w:fill="E2EFD9"/>
             <w:vAlign w:val="center"/>
           </w:tcPr>
           <w:p>
@@ -9059,7 +9060,7 @@
         <w:tc>
           <w:tcPr>
             <w:tcW w:type="dxa" w:w="1560"/>
-            <w:shd w:val="clear" w:color="auto" w:fill="FFFFFF"/>
+            <w:shd w:val="clear" w:color="auto" w:fill="E2EFD9"/>
           </w:tcPr>
           <w:p>
             <w:pPr>
@@ -9081,7 +9082,7 @@
         <w:tc>
           <w:tcPr>
             <w:tcW w:type="dxa" w:w="1048"/>
-            <w:shd w:val="clear" w:color="auto" w:fill="FFFFFF"/>
+            <w:shd w:val="clear" w:color="auto" w:fill="E2EFD9"/>
           </w:tcPr>
           <w:p>
             <w:pPr>
@@ -9103,7 +9104,7 @@
           <w:tcPr>
             <w:tcW w:type="dxa" w:w="4059"/>
             <w:gridSpan w:val="2"/>
-            <w:shd w:val="clear" w:color="auto" w:fill="FFFFFF"/>
+            <w:shd w:val="clear" w:color="auto" w:fill="E2EFD9"/>
           </w:tcPr>
           <w:p>
             <w:pPr>
@@ -9146,7 +9147,7 @@
         <w:tc>
           <w:tcPr>
             <w:tcW w:type="dxa" w:w="708"/>
-            <w:shd w:val="clear" w:color="auto" w:fill="FFFFFF"/>
+            <w:shd w:val="clear" w:color="auto" w:fill="E2EFD9"/>
             <w:vAlign w:val="center"/>
           </w:tcPr>
           <w:p>
@@ -9168,7 +9169,7 @@
         <w:tc>
           <w:tcPr>
             <w:tcW w:type="dxa" w:w="1560"/>
-            <w:shd w:val="clear" w:color="auto" w:fill="FFFFFF"/>
+            <w:shd w:val="clear" w:color="auto" w:fill="E2EFD9"/>
           </w:tcPr>
           <w:p>
             <w:pPr>
@@ -9190,7 +9191,7 @@
         <w:tc>
           <w:tcPr>
             <w:tcW w:type="dxa" w:w="1048"/>
-            <w:shd w:val="clear" w:color="auto" w:fill="FFFFFF"/>
+            <w:shd w:val="clear" w:color="auto" w:fill="E2EFD9"/>
           </w:tcPr>
           <w:p>
             <w:pPr>
@@ -9212,7 +9213,7 @@
           <w:tcPr>
             <w:tcW w:type="dxa" w:w="4059"/>
             <w:gridSpan w:val="2"/>
-            <w:shd w:val="clear" w:color="auto" w:fill="FFFFFF"/>
+            <w:shd w:val="clear" w:color="auto" w:fill="E2EFD9"/>
           </w:tcPr>
           <w:p>
             <w:pPr>
@@ -9255,7 +9256,7 @@
         <w:tc>
           <w:tcPr>
             <w:tcW w:type="dxa" w:w="708"/>
-            <w:shd w:val="clear" w:color="auto" w:fill="FFFFFF"/>
+            <w:shd w:val="clear" w:color="auto" w:fill="E2EFD9"/>
             <w:vAlign w:val="center"/>
           </w:tcPr>
           <w:p>
@@ -9277,7 +9278,7 @@
         <w:tc>
           <w:tcPr>
             <w:tcW w:type="dxa" w:w="1560"/>
-            <w:shd w:val="clear" w:color="auto" w:fill="FFFFFF"/>
+            <w:shd w:val="clear" w:color="auto" w:fill="E2EFD9"/>
           </w:tcPr>
           <w:p>
             <w:pPr>
@@ -9299,7 +9300,7 @@
         <w:tc>
           <w:tcPr>
             <w:tcW w:type="dxa" w:w="1048"/>
-            <w:shd w:val="clear" w:color="auto" w:fill="FFFFFF"/>
+            <w:shd w:val="clear" w:color="auto" w:fill="E2EFD9"/>
           </w:tcPr>
           <w:p>
             <w:pPr>
@@ -9321,7 +9322,7 @@
           <w:tcPr>
             <w:tcW w:type="dxa" w:w="4059"/>
             <w:gridSpan w:val="2"/>
-            <w:shd w:val="clear" w:color="auto" w:fill="FFFFFF"/>
+            <w:shd w:val="clear" w:color="auto" w:fill="E2EFD9"/>
           </w:tcPr>
           <w:p>
             <w:pPr>
@@ -9364,7 +9365,7 @@
         <w:tc>
           <w:tcPr>
             <w:tcW w:type="dxa" w:w="708"/>
-            <w:shd w:val="clear" w:color="auto" w:fill="FFFFFF"/>
+            <w:shd w:val="clear" w:color="auto" w:fill="E2EFD9"/>
             <w:vAlign w:val="center"/>
           </w:tcPr>
           <w:p>
@@ -9386,7 +9387,7 @@
         <w:tc>
           <w:tcPr>
             <w:tcW w:type="dxa" w:w="1560"/>
-            <w:shd w:val="clear" w:color="auto" w:fill="FFFFFF"/>
+            <w:shd w:val="clear" w:color="auto" w:fill="E2EFD9"/>
           </w:tcPr>
           <w:p>
             <w:pPr>
@@ -9408,7 +9409,7 @@
         <w:tc>
           <w:tcPr>
             <w:tcW w:type="dxa" w:w="1048"/>
-            <w:shd w:val="clear" w:color="auto" w:fill="FFFFFF"/>
+            <w:shd w:val="clear" w:color="auto" w:fill="E2EFD9"/>
           </w:tcPr>
           <w:p>
             <w:pPr>
@@ -9430,7 +9431,7 @@
           <w:tcPr>
             <w:tcW w:type="dxa" w:w="4059"/>
             <w:gridSpan w:val="2"/>
-            <w:shd w:val="clear" w:color="auto" w:fill="FFFFFF"/>
+            <w:shd w:val="clear" w:color="auto" w:fill="E2EFD9"/>
           </w:tcPr>
           <w:p>
             <w:pPr>
@@ -9498,7 +9499,7 @@
           <w:tcPr>
             <w:tcW w:type="dxa" w:w="7375"/>
             <w:gridSpan w:val="5"/>
-            <w:shd w:val="clear" w:color="auto" w:fill="FFFFFF"/>
+            <w:shd w:val="clear" w:color="auto" w:fill="E2EFD9"/>
           </w:tcPr>
           <w:p>
             <w:pPr>
@@ -9656,7 +9657,7 @@
           <w:tcPr>
             <w:tcW w:type="dxa" w:w="7375"/>
             <w:gridSpan w:val="5"/>
-            <w:shd w:val="clear" w:color="auto" w:fill="FFFFFF"/>
+            <w:shd w:val="clear" w:color="auto" w:fill="E2EFD9"/>
           </w:tcPr>
           <w:p>
             <w:pPr>
@@ -10269,7 +10270,7 @@
           <w:tcPr>
             <w:tcW w:type="dxa" w:w="7375"/>
             <w:gridSpan w:val="5"/>
-            <w:shd w:val="clear" w:color="auto" w:fill="FFFFFF"/>
+            <w:shd w:val="clear" w:color="auto" w:fill="E2EFD9"/>
           </w:tcPr>
           <w:p>
             <w:pPr>
@@ -10368,7 +10369,7 @@
           <w:tcPr>
             <w:tcW w:type="dxa" w:w="7375"/>
             <w:gridSpan w:val="5"/>
-            <w:shd w:val="clear" w:color="auto" w:fill="FFFFFF"/>
+            <w:shd w:val="clear" w:color="auto" w:fill="E2EFD9"/>
           </w:tcPr>
           <w:p>
             <w:pPr>
@@ -10468,7 +10469,7 @@
           <w:tcPr>
             <w:tcW w:type="dxa" w:w="7375"/>
             <w:gridSpan w:val="5"/>
-            <w:shd w:val="clear" w:color="auto" w:fill="FFFFFF"/>
+            <w:shd w:val="clear" w:color="auto" w:fill="E2EFD9"/>
           </w:tcPr>
           <w:p>
             <w:pPr>
@@ -10514,7 +10515,7 @@
           <w:tcPr>
             <w:tcW w:type="dxa" w:w="7375"/>
             <w:gridSpan w:val="5"/>
-            <w:shd w:val="clear" w:color="auto" w:fill="FFFFFF"/>
+            <w:shd w:val="clear" w:color="auto" w:fill="E2EFD9"/>
           </w:tcPr>
           <w:p>
             <w:pPr>
@@ -10726,7 +10727,7 @@
           <w:tcPr>
             <w:tcW w:type="dxa" w:w="7375"/>
             <w:gridSpan w:val="5"/>
-            <w:shd w:val="clear" w:color="auto" w:fill="FFFFFF"/>
+            <w:shd w:val="clear" w:color="auto" w:fill="E2EFD9"/>
           </w:tcPr>
           <w:p>
             <w:pPr>
@@ -10772,7 +10773,7 @@
           <w:tcPr>
             <w:tcW w:type="dxa" w:w="7375"/>
             <w:gridSpan w:val="5"/>
-            <w:shd w:val="clear" w:color="auto" w:fill="FFFFFF"/>
+            <w:shd w:val="clear" w:color="auto" w:fill="E2EFD9"/>
           </w:tcPr>
           <w:p>
             <w:pPr>
@@ -10874,7 +10875,7 @@
           <w:tcPr>
             <w:tcW w:type="dxa" w:w="7375"/>
             <w:gridSpan w:val="5"/>
-            <w:shd w:val="clear" w:color="auto" w:fill="FFFFFF"/>
+            <w:shd w:val="clear" w:color="auto" w:fill="E2EFD9"/>
           </w:tcPr>
           <w:p>
             <w:pPr>
@@ -11031,7 +11032,7 @@
         <w:tc>
           <w:tcPr>
             <w:tcW w:type="dxa" w:w="708"/>
-            <w:shd w:val="clear" w:color="auto" w:fill="FFFFFF"/>
+            <w:shd w:val="clear" w:color="auto" w:fill="E2EFD9"/>
             <w:vAlign w:val="center"/>
           </w:tcPr>
           <w:p>
@@ -11053,7 +11054,7 @@
         <w:tc>
           <w:tcPr>
             <w:tcW w:type="dxa" w:w="1560"/>
-            <w:shd w:val="clear" w:color="auto" w:fill="FFFFFF"/>
+            <w:shd w:val="clear" w:color="auto" w:fill="E2EFD9"/>
           </w:tcPr>
           <w:p>
             <w:pPr>
@@ -11075,7 +11076,7 @@
         <w:tc>
           <w:tcPr>
             <w:tcW w:type="dxa" w:w="1048"/>
-            <w:shd w:val="clear" w:color="auto" w:fill="FFFFFF"/>
+            <w:shd w:val="clear" w:color="auto" w:fill="E2EFD9"/>
           </w:tcPr>
           <w:p>
             <w:pPr>
@@ -11097,7 +11098,7 @@
           <w:tcPr>
             <w:tcW w:type="dxa" w:w="4059"/>
             <w:gridSpan w:val="2"/>
-            <w:shd w:val="clear" w:color="auto" w:fill="FFFFFF"/>
+            <w:shd w:val="clear" w:color="auto" w:fill="E2EFD9"/>
           </w:tcPr>
           <w:p>
             <w:pPr>
@@ -11140,7 +11141,7 @@
         <w:tc>
           <w:tcPr>
             <w:tcW w:type="dxa" w:w="708"/>
-            <w:shd w:val="clear" w:color="auto" w:fill="FFFFFF"/>
+            <w:shd w:val="clear" w:color="auto" w:fill="E2EFD9"/>
             <w:vAlign w:val="center"/>
           </w:tcPr>
           <w:p>
@@ -11162,7 +11163,7 @@
         <w:tc>
           <w:tcPr>
             <w:tcW w:type="dxa" w:w="1560"/>
-            <w:shd w:val="clear" w:color="auto" w:fill="FFFFFF"/>
+            <w:shd w:val="clear" w:color="auto" w:fill="E2EFD9"/>
           </w:tcPr>
           <w:p>
             <w:pPr>
@@ -11184,7 +11185,7 @@
         <w:tc>
           <w:tcPr>
             <w:tcW w:type="dxa" w:w="1048"/>
-            <w:shd w:val="clear" w:color="auto" w:fill="FFFFFF"/>
+            <w:shd w:val="clear" w:color="auto" w:fill="E2EFD9"/>
           </w:tcPr>
           <w:p>
             <w:pPr>
@@ -11206,7 +11207,7 @@
           <w:tcPr>
             <w:tcW w:type="dxa" w:w="4059"/>
             <w:gridSpan w:val="2"/>
-            <w:shd w:val="clear" w:color="auto" w:fill="FFFFFF"/>
+            <w:shd w:val="clear" w:color="auto" w:fill="E2EFD9"/>
           </w:tcPr>
           <w:p>
             <w:pPr>
@@ -11249,7 +11250,7 @@
         <w:tc>
           <w:tcPr>
             <w:tcW w:type="dxa" w:w="708"/>
-            <w:shd w:val="clear" w:color="auto" w:fill="FFFFFF"/>
+            <w:shd w:val="clear" w:color="auto" w:fill="E2EFD9"/>
             <w:vAlign w:val="center"/>
           </w:tcPr>
           <w:p>
@@ -11271,7 +11272,7 @@
         <w:tc>
           <w:tcPr>
             <w:tcW w:type="dxa" w:w="1560"/>
-            <w:shd w:val="clear" w:color="auto" w:fill="FFFFFF"/>
+            <w:shd w:val="clear" w:color="auto" w:fill="E2EFD9"/>
           </w:tcPr>
           <w:p>
             <w:pPr>
@@ -11293,7 +11294,7 @@
         <w:tc>
           <w:tcPr>
             <w:tcW w:type="dxa" w:w="1048"/>
-            <w:shd w:val="clear" w:color="auto" w:fill="FFFFFF"/>
+            <w:shd w:val="clear" w:color="auto" w:fill="E2EFD9"/>
           </w:tcPr>
           <w:p>
             <w:pPr>
@@ -11315,7 +11316,7 @@
           <w:tcPr>
             <w:tcW w:type="dxa" w:w="4059"/>
             <w:gridSpan w:val="2"/>
-            <w:shd w:val="clear" w:color="auto" w:fill="FFFFFF"/>
+            <w:shd w:val="clear" w:color="auto" w:fill="E2EFD9"/>
           </w:tcPr>
           <w:p>
             <w:pPr>
@@ -11358,7 +11359,7 @@
         <w:tc>
           <w:tcPr>
             <w:tcW w:type="dxa" w:w="708"/>
-            <w:shd w:val="clear" w:color="auto" w:fill="FFFFFF"/>
+            <w:shd w:val="clear" w:color="auto" w:fill="E2EFD9"/>
             <w:vAlign w:val="center"/>
           </w:tcPr>
           <w:p>
@@ -11380,7 +11381,7 @@
         <w:tc>
           <w:tcPr>
             <w:tcW w:type="dxa" w:w="1560"/>
-            <w:shd w:val="clear" w:color="auto" w:fill="FFFFFF"/>
+            <w:shd w:val="clear" w:color="auto" w:fill="E2EFD9"/>
           </w:tcPr>
           <w:p>
             <w:pPr>
@@ -11402,7 +11403,7 @@
         <w:tc>
           <w:tcPr>
             <w:tcW w:type="dxa" w:w="1048"/>
-            <w:shd w:val="clear" w:color="auto" w:fill="FFFFFF"/>
+            <w:shd w:val="clear" w:color="auto" w:fill="E2EFD9"/>
           </w:tcPr>
           <w:p>
             <w:pPr>
@@ -11424,7 +11425,7 @@
           <w:tcPr>
             <w:tcW w:type="dxa" w:w="4059"/>
             <w:gridSpan w:val="2"/>
-            <w:shd w:val="clear" w:color="auto" w:fill="FFFFFF"/>
+            <w:shd w:val="clear" w:color="auto" w:fill="E2EFD9"/>
           </w:tcPr>
           <w:p>
             <w:pPr>
@@ -11467,7 +11468,7 @@
         <w:tc>
           <w:tcPr>
             <w:tcW w:type="dxa" w:w="708"/>
-            <w:shd w:val="clear" w:color="auto" w:fill="FFFFFF"/>
+            <w:shd w:val="clear" w:color="auto" w:fill="E2EFD9"/>
             <w:vAlign w:val="center"/>
           </w:tcPr>
           <w:p>
@@ -11489,7 +11490,7 @@
         <w:tc>
           <w:tcPr>
             <w:tcW w:type="dxa" w:w="1560"/>
-            <w:shd w:val="clear" w:color="auto" w:fill="FFFFFF"/>
+            <w:shd w:val="clear" w:color="auto" w:fill="E2EFD9"/>
           </w:tcPr>
           <w:p>
             <w:pPr>
@@ -11511,7 +11512,7 @@
         <w:tc>
           <w:tcPr>
             <w:tcW w:type="dxa" w:w="1048"/>
-            <w:shd w:val="clear" w:color="auto" w:fill="FFFFFF"/>
+            <w:shd w:val="clear" w:color="auto" w:fill="E2EFD9"/>
           </w:tcPr>
           <w:p>
             <w:pPr>
@@ -11533,7 +11534,7 @@
           <w:tcPr>
             <w:tcW w:type="dxa" w:w="4059"/>
             <w:gridSpan w:val="2"/>
-            <w:shd w:val="clear" w:color="auto" w:fill="FFFFFF"/>
+            <w:shd w:val="clear" w:color="auto" w:fill="E2EFD9"/>
           </w:tcPr>
           <w:p>
             <w:pPr>
@@ -11576,7 +11577,7 @@
         <w:tc>
           <w:tcPr>
             <w:tcW w:type="dxa" w:w="708"/>
-            <w:shd w:val="clear" w:color="auto" w:fill="FFFFFF"/>
+            <w:shd w:val="clear" w:color="auto" w:fill="E2EFD9"/>
             <w:vAlign w:val="center"/>
           </w:tcPr>
           <w:p>
@@ -11598,7 +11599,7 @@
         <w:tc>
           <w:tcPr>
             <w:tcW w:type="dxa" w:w="1560"/>
-            <w:shd w:val="clear" w:color="auto" w:fill="FFFFFF"/>
+            <w:shd w:val="clear" w:color="auto" w:fill="E2EFD9"/>
           </w:tcPr>
           <w:p>
             <w:pPr>
@@ -11620,7 +11621,7 @@
         <w:tc>
           <w:tcPr>
             <w:tcW w:type="dxa" w:w="1048"/>
-            <w:shd w:val="clear" w:color="auto" w:fill="FFFFFF"/>
+            <w:shd w:val="clear" w:color="auto" w:fill="E2EFD9"/>
           </w:tcPr>
           <w:p>
             <w:pPr>
@@ -11642,7 +11643,7 @@
           <w:tcPr>
             <w:tcW w:type="dxa" w:w="4059"/>
             <w:gridSpan w:val="2"/>
-            <w:shd w:val="clear" w:color="auto" w:fill="FFFFFF"/>
+            <w:shd w:val="clear" w:color="auto" w:fill="E2EFD9"/>
           </w:tcPr>
           <w:p>
             <w:pPr>
@@ -11685,7 +11686,7 @@
         <w:tc>
           <w:tcPr>
             <w:tcW w:type="dxa" w:w="708"/>
-            <w:shd w:val="clear" w:color="auto" w:fill="FFFFFF"/>
+            <w:shd w:val="clear" w:color="auto" w:fill="E2EFD9"/>
             <w:vAlign w:val="center"/>
           </w:tcPr>
           <w:p>
@@ -11707,7 +11708,7 @@
         <w:tc>
           <w:tcPr>
             <w:tcW w:type="dxa" w:w="1560"/>
-            <w:shd w:val="clear" w:color="auto" w:fill="FFFFFF"/>
+            <w:shd w:val="clear" w:color="auto" w:fill="E2EFD9"/>
           </w:tcPr>
           <w:p>
             <w:pPr>
@@ -11729,7 +11730,7 @@
         <w:tc>
           <w:tcPr>
             <w:tcW w:type="dxa" w:w="1048"/>
-            <w:shd w:val="clear" w:color="auto" w:fill="FFFFFF"/>
+            <w:shd w:val="clear" w:color="auto" w:fill="E2EFD9"/>
           </w:tcPr>
           <w:p>
             <w:pPr>
@@ -11751,7 +11752,7 @@
           <w:tcPr>
             <w:tcW w:type="dxa" w:w="4059"/>
             <w:gridSpan w:val="2"/>
-            <w:shd w:val="clear" w:color="auto" w:fill="FFFFFF"/>
+            <w:shd w:val="clear" w:color="auto" w:fill="E2EFD9"/>
           </w:tcPr>
           <w:p>
             <w:pPr>
@@ -11794,7 +11795,7 @@
         <w:tc>
           <w:tcPr>
             <w:tcW w:type="dxa" w:w="708"/>
-            <w:shd w:val="clear" w:color="auto" w:fill="FFFFFF"/>
+            <w:shd w:val="clear" w:color="auto" w:fill="E2EFD9"/>
             <w:vAlign w:val="center"/>
           </w:tcPr>
           <w:p>
@@ -11816,7 +11817,7 @@
         <w:tc>
           <w:tcPr>
             <w:tcW w:type="dxa" w:w="1560"/>
-            <w:shd w:val="clear" w:color="auto" w:fill="FFFFFF"/>
+            <w:shd w:val="clear" w:color="auto" w:fill="E2EFD9"/>
           </w:tcPr>
           <w:p>
             <w:pPr>
@@ -11838,7 +11839,7 @@
         <w:tc>
           <w:tcPr>
             <w:tcW w:type="dxa" w:w="1048"/>
-            <w:shd w:val="clear" w:color="auto" w:fill="FFFFFF"/>
+            <w:shd w:val="clear" w:color="auto" w:fill="E2EFD9"/>
           </w:tcPr>
           <w:p>
             <w:pPr>
@@ -11860,7 +11861,7 @@
           <w:tcPr>
             <w:tcW w:type="dxa" w:w="4059"/>
             <w:gridSpan w:val="2"/>
-            <w:shd w:val="clear" w:color="auto" w:fill="FFFFFF"/>
+            <w:shd w:val="clear" w:color="auto" w:fill="E2EFD9"/>
           </w:tcPr>
           <w:p>
             <w:pPr>
@@ -11903,7 +11904,7 @@
         <w:tc>
           <w:tcPr>
             <w:tcW w:type="dxa" w:w="708"/>
-            <w:shd w:val="clear" w:color="auto" w:fill="FFFFFF"/>
+            <w:shd w:val="clear" w:color="auto" w:fill="E2EFD9"/>
             <w:vAlign w:val="center"/>
           </w:tcPr>
           <w:p>
@@ -11925,7 +11926,7 @@
         <w:tc>
           <w:tcPr>
             <w:tcW w:type="dxa" w:w="1560"/>
-            <w:shd w:val="clear" w:color="auto" w:fill="FFFFFF"/>
+            <w:shd w:val="clear" w:color="auto" w:fill="E2EFD9"/>
           </w:tcPr>
           <w:p>
             <w:pPr>
@@ -11947,7 +11948,7 @@
         <w:tc>
           <w:tcPr>
             <w:tcW w:type="dxa" w:w="1048"/>
-            <w:shd w:val="clear" w:color="auto" w:fill="FFFFFF"/>
+            <w:shd w:val="clear" w:color="auto" w:fill="E2EFD9"/>
           </w:tcPr>
           <w:p>
             <w:pPr>
@@ -11969,7 +11970,7 @@
           <w:tcPr>
             <w:tcW w:type="dxa" w:w="4059"/>
             <w:gridSpan w:val="2"/>
-            <w:shd w:val="clear" w:color="auto" w:fill="FFFFFF"/>
+            <w:shd w:val="clear" w:color="auto" w:fill="E2EFD9"/>
           </w:tcPr>
           <w:p>
             <w:pPr>
@@ -12012,7 +12013,7 @@
         <w:tc>
           <w:tcPr>
             <w:tcW w:type="dxa" w:w="708"/>
-            <w:shd w:val="clear" w:color="auto" w:fill="FFFFFF"/>
+            <w:shd w:val="clear" w:color="auto" w:fill="E2EFD9"/>
             <w:vAlign w:val="center"/>
           </w:tcPr>
           <w:p>
@@ -12034,7 +12035,7 @@
         <w:tc>
           <w:tcPr>
             <w:tcW w:type="dxa" w:w="1560"/>
-            <w:shd w:val="clear" w:color="auto" w:fill="FFFFFF"/>
+            <w:shd w:val="clear" w:color="auto" w:fill="E2EFD9"/>
           </w:tcPr>
           <w:p>
             <w:pPr>
@@ -12056,7 +12057,7 @@
         <w:tc>
           <w:tcPr>
             <w:tcW w:type="dxa" w:w="1048"/>
-            <w:shd w:val="clear" w:color="auto" w:fill="FFFFFF"/>
+            <w:shd w:val="clear" w:color="auto" w:fill="E2EFD9"/>
           </w:tcPr>
           <w:p>
             <w:pPr>
@@ -12078,7 +12079,7 @@
           <w:tcPr>
             <w:tcW w:type="dxa" w:w="4059"/>
             <w:gridSpan w:val="2"/>
-            <w:shd w:val="clear" w:color="auto" w:fill="FFFFFF"/>
+            <w:shd w:val="clear" w:color="auto" w:fill="E2EFD9"/>
           </w:tcPr>
           <w:p>
             <w:pPr>
@@ -12121,7 +12122,7 @@
         <w:tc>
           <w:tcPr>
             <w:tcW w:type="dxa" w:w="708"/>
-            <w:shd w:val="clear" w:color="auto" w:fill="FFFFFF"/>
+            <w:shd w:val="clear" w:color="auto" w:fill="E2EFD9"/>
             <w:vAlign w:val="center"/>
           </w:tcPr>
           <w:p>
@@ -12143,7 +12144,7 @@
         <w:tc>
           <w:tcPr>
             <w:tcW w:type="dxa" w:w="1560"/>
-            <w:shd w:val="clear" w:color="auto" w:fill="FFFFFF"/>
+            <w:shd w:val="clear" w:color="auto" w:fill="E2EFD9"/>
           </w:tcPr>
           <w:p>
             <w:pPr>
@@ -12165,7 +12166,7 @@
         <w:tc>
           <w:tcPr>
             <w:tcW w:type="dxa" w:w="1048"/>
-            <w:shd w:val="clear" w:color="auto" w:fill="FFFFFF"/>
+            <w:shd w:val="clear" w:color="auto" w:fill="E2EFD9"/>
           </w:tcPr>
           <w:p>
             <w:pPr>
@@ -12187,7 +12188,7 @@
           <w:tcPr>
             <w:tcW w:type="dxa" w:w="4059"/>
             <w:gridSpan w:val="2"/>
-            <w:shd w:val="clear" w:color="auto" w:fill="FFFFFF"/>
+            <w:shd w:val="clear" w:color="auto" w:fill="E2EFD9"/>
           </w:tcPr>
           <w:p>
             <w:pPr>
@@ -12230,7 +12231,7 @@
         <w:tc>
           <w:tcPr>
             <w:tcW w:type="dxa" w:w="708"/>
-            <w:shd w:val="clear" w:color="auto" w:fill="FFFFFF"/>
+            <w:shd w:val="clear" w:color="auto" w:fill="E2EFD9"/>
             <w:vAlign w:val="center"/>
           </w:tcPr>
           <w:p>
@@ -12252,7 +12253,7 @@
         <w:tc>
           <w:tcPr>
             <w:tcW w:type="dxa" w:w="1560"/>
-            <w:shd w:val="clear" w:color="auto" w:fill="FFFFFF"/>
+            <w:shd w:val="clear" w:color="auto" w:fill="E2EFD9"/>
           </w:tcPr>
           <w:p>
             <w:pPr>
@@ -12274,7 +12275,7 @@
         <w:tc>
           <w:tcPr>
             <w:tcW w:type="dxa" w:w="1048"/>
-            <w:shd w:val="clear" w:color="auto" w:fill="FFFFFF"/>
+            <w:shd w:val="clear" w:color="auto" w:fill="E2EFD9"/>
           </w:tcPr>
           <w:p>
             <w:pPr>
@@ -12296,7 +12297,7 @@
           <w:tcPr>
             <w:tcW w:type="dxa" w:w="4059"/>
             <w:gridSpan w:val="2"/>
-            <w:shd w:val="clear" w:color="auto" w:fill="FFFFFF"/>
+            <w:shd w:val="clear" w:color="auto" w:fill="E2EFD9"/>
           </w:tcPr>
           <w:p>
             <w:pPr>
@@ -12364,7 +12365,7 @@
           <w:tcPr>
             <w:tcW w:type="dxa" w:w="7375"/>
             <w:gridSpan w:val="5"/>
-            <w:shd w:val="clear" w:color="auto" w:fill="FFFFFF"/>
+            <w:shd w:val="clear" w:color="auto" w:fill="E2EFD9"/>
           </w:tcPr>
           <w:p>
             <w:pPr>
@@ -12536,7 +12537,7 @@
           <w:tcPr>
             <w:tcW w:type="dxa" w:w="7375"/>
             <w:gridSpan w:val="5"/>
-            <w:shd w:val="clear" w:color="auto" w:fill="FFFFFF"/>
+            <w:shd w:val="clear" w:color="auto" w:fill="E2EFD9"/>
           </w:tcPr>
           <w:p>
             <w:pPr>
@@ -13864,7 +13865,7 @@
           <w:tcPr>
             <w:tcW w:type="dxa" w:w="7375"/>
             <w:gridSpan w:val="5"/>
-            <w:shd w:val="clear" w:color="auto" w:fill="FFFFFF"/>
+            <w:shd w:val="clear" w:color="auto" w:fill="E2EFD9"/>
           </w:tcPr>
           <w:p>
             <w:pPr>
@@ -13963,7 +13964,7 @@
           <w:tcPr>
             <w:tcW w:type="dxa" w:w="7375"/>
             <w:gridSpan w:val="5"/>
-            <w:shd w:val="clear" w:color="auto" w:fill="FFFFFF"/>
+            <w:shd w:val="clear" w:color="auto" w:fill="E2EFD9"/>
           </w:tcPr>
           <w:p>
             <w:pPr>
@@ -14063,7 +14064,7 @@
           <w:tcPr>
             <w:tcW w:type="dxa" w:w="7375"/>
             <w:gridSpan w:val="5"/>
-            <w:shd w:val="clear" w:color="auto" w:fill="FFFFFF"/>
+            <w:shd w:val="clear" w:color="auto" w:fill="E2EFD9"/>
           </w:tcPr>
           <w:p>
             <w:pPr>
@@ -14109,7 +14110,7 @@
           <w:tcPr>
             <w:tcW w:type="dxa" w:w="7375"/>
             <w:gridSpan w:val="5"/>
-            <w:shd w:val="clear" w:color="auto" w:fill="FFFFFF"/>
+            <w:shd w:val="clear" w:color="auto" w:fill="E2EFD9"/>
           </w:tcPr>
           <w:p>
             <w:pPr>
@@ -14310,7 +14311,7 @@
           <w:tcPr>
             <w:tcW w:type="dxa" w:w="7375"/>
             <w:gridSpan w:val="5"/>
-            <w:shd w:val="clear" w:color="auto" w:fill="FFFFFF"/>
+            <w:shd w:val="clear" w:color="auto" w:fill="E2EFD9"/>
           </w:tcPr>
           <w:p>
             <w:pPr>
@@ -14356,7 +14357,7 @@
           <w:tcPr>
             <w:tcW w:type="dxa" w:w="7375"/>
             <w:gridSpan w:val="5"/>
-            <w:shd w:val="clear" w:color="auto" w:fill="FFFFFF"/>
+            <w:shd w:val="clear" w:color="auto" w:fill="E2EFD9"/>
           </w:tcPr>
           <w:p>
             <w:pPr>
@@ -14458,7 +14459,7 @@
           <w:tcPr>
             <w:tcW w:type="dxa" w:w="7375"/>
             <w:gridSpan w:val="5"/>
-            <w:shd w:val="clear" w:color="auto" w:fill="FFFFFF"/>
+            <w:shd w:val="clear" w:color="auto" w:fill="E2EFD9"/>
           </w:tcPr>
           <w:p>
             <w:pPr>
@@ -14615,7 +14616,7 @@
         <w:tc>
           <w:tcPr>
             <w:tcW w:type="dxa" w:w="708"/>
-            <w:shd w:val="clear" w:color="auto" w:fill="FFFFFF"/>
+            <w:shd w:val="clear" w:color="auto" w:fill="E2EFD9"/>
             <w:vAlign w:val="center"/>
           </w:tcPr>
           <w:p>
@@ -14637,7 +14638,7 @@
         <w:tc>
           <w:tcPr>
             <w:tcW w:type="dxa" w:w="1560"/>
-            <w:shd w:val="clear" w:color="auto" w:fill="FFFFFF"/>
+            <w:shd w:val="clear" w:color="auto" w:fill="E2EFD9"/>
           </w:tcPr>
           <w:p>
             <w:pPr>
@@ -14659,7 +14660,7 @@
         <w:tc>
           <w:tcPr>
             <w:tcW w:type="dxa" w:w="1048"/>
-            <w:shd w:val="clear" w:color="auto" w:fill="FFFFFF"/>
+            <w:shd w:val="clear" w:color="auto" w:fill="E2EFD9"/>
           </w:tcPr>
           <w:p>
             <w:pPr>
@@ -14681,7 +14682,7 @@
           <w:tcPr>
             <w:tcW w:type="dxa" w:w="4059"/>
             <w:gridSpan w:val="2"/>
-            <w:shd w:val="clear" w:color="auto" w:fill="FFFFFF"/>
+            <w:shd w:val="clear" w:color="auto" w:fill="E2EFD9"/>
           </w:tcPr>
           <w:p>
             <w:pPr>
@@ -14724,7 +14725,7 @@
         <w:tc>
           <w:tcPr>
             <w:tcW w:type="dxa" w:w="708"/>
-            <w:shd w:val="clear" w:color="auto" w:fill="FFFFFF"/>
+            <w:shd w:val="clear" w:color="auto" w:fill="E2EFD9"/>
             <w:vAlign w:val="center"/>
           </w:tcPr>
           <w:p>
@@ -14746,7 +14747,7 @@
         <w:tc>
           <w:tcPr>
             <w:tcW w:type="dxa" w:w="1560"/>
-            <w:shd w:val="clear" w:color="auto" w:fill="FFFFFF"/>
+            <w:shd w:val="clear" w:color="auto" w:fill="E2EFD9"/>
           </w:tcPr>
           <w:p>
             <w:pPr>
@@ -14768,7 +14769,7 @@
         <w:tc>
           <w:tcPr>
             <w:tcW w:type="dxa" w:w="1048"/>
-            <w:shd w:val="clear" w:color="auto" w:fill="FFFFFF"/>
+            <w:shd w:val="clear" w:color="auto" w:fill="E2EFD9"/>
           </w:tcPr>
           <w:p>
             <w:pPr>
@@ -14790,7 +14791,7 @@
           <w:tcPr>
             <w:tcW w:type="dxa" w:w="4059"/>
             <w:gridSpan w:val="2"/>
-            <w:shd w:val="clear" w:color="auto" w:fill="FFFFFF"/>
+            <w:shd w:val="clear" w:color="auto" w:fill="E2EFD9"/>
           </w:tcPr>
           <w:p>
             <w:pPr>
@@ -14833,7 +14834,7 @@
         <w:tc>
           <w:tcPr>
             <w:tcW w:type="dxa" w:w="708"/>
-            <w:shd w:val="clear" w:color="auto" w:fill="FFFFFF"/>
+            <w:shd w:val="clear" w:color="auto" w:fill="E2EFD9"/>
             <w:vAlign w:val="center"/>
           </w:tcPr>
           <w:p>
@@ -14855,7 +14856,7 @@
         <w:tc>
           <w:tcPr>
             <w:tcW w:type="dxa" w:w="1560"/>
-            <w:shd w:val="clear" w:color="auto" w:fill="FFFFFF"/>
+            <w:shd w:val="clear" w:color="auto" w:fill="E2EFD9"/>
           </w:tcPr>
           <w:p>
             <w:pPr>
@@ -14877,7 +14878,7 @@
         <w:tc>
           <w:tcPr>
             <w:tcW w:type="dxa" w:w="1048"/>
-            <w:shd w:val="clear" w:color="auto" w:fill="FFFFFF"/>
+            <w:shd w:val="clear" w:color="auto" w:fill="E2EFD9"/>
           </w:tcPr>
           <w:p>
             <w:pPr>
@@ -14899,7 +14900,7 @@
           <w:tcPr>
             <w:tcW w:type="dxa" w:w="4059"/>
             <w:gridSpan w:val="2"/>
-            <w:shd w:val="clear" w:color="auto" w:fill="FFFFFF"/>
+            <w:shd w:val="clear" w:color="auto" w:fill="E2EFD9"/>
           </w:tcPr>
           <w:p>
             <w:pPr>
@@ -14942,7 +14943,7 @@
         <w:tc>
           <w:tcPr>
             <w:tcW w:type="dxa" w:w="708"/>
-            <w:shd w:val="clear" w:color="auto" w:fill="FFFFFF"/>
+            <w:shd w:val="clear" w:color="auto" w:fill="E2EFD9"/>
             <w:vAlign w:val="center"/>
           </w:tcPr>
           <w:p>
@@ -14964,7 +14965,7 @@
         <w:tc>
           <w:tcPr>
             <w:tcW w:type="dxa" w:w="1560"/>
-            <w:shd w:val="clear" w:color="auto" w:fill="FFFFFF"/>
+            <w:shd w:val="clear" w:color="auto" w:fill="E2EFD9"/>
           </w:tcPr>
           <w:p>
             <w:pPr>
@@ -14986,7 +14987,7 @@
         <w:tc>
           <w:tcPr>
             <w:tcW w:type="dxa" w:w="1048"/>
-            <w:shd w:val="clear" w:color="auto" w:fill="FFFFFF"/>
+            <w:shd w:val="clear" w:color="auto" w:fill="E2EFD9"/>
           </w:tcPr>
           <w:p>
             <w:pPr>
@@ -15008,7 +15009,7 @@
           <w:tcPr>
             <w:tcW w:type="dxa" w:w="4059"/>
             <w:gridSpan w:val="2"/>
-            <w:shd w:val="clear" w:color="auto" w:fill="FFFFFF"/>
+            <w:shd w:val="clear" w:color="auto" w:fill="E2EFD9"/>
           </w:tcPr>
           <w:p>
             <w:pPr>
@@ -15051,7 +15052,7 @@
         <w:tc>
           <w:tcPr>
             <w:tcW w:type="dxa" w:w="708"/>
-            <w:shd w:val="clear" w:color="auto" w:fill="FFFFFF"/>
+            <w:shd w:val="clear" w:color="auto" w:fill="E2EFD9"/>
             <w:vAlign w:val="center"/>
           </w:tcPr>
           <w:p>
@@ -15073,7 +15074,7 @@
         <w:tc>
           <w:tcPr>
             <w:tcW w:type="dxa" w:w="1560"/>
-            <w:shd w:val="clear" w:color="auto" w:fill="FFFFFF"/>
+            <w:shd w:val="clear" w:color="auto" w:fill="E2EFD9"/>
           </w:tcPr>
           <w:p>
             <w:pPr>
@@ -15095,7 +15096,7 @@
         <w:tc>
           <w:tcPr>
             <w:tcW w:type="dxa" w:w="1048"/>
-            <w:shd w:val="clear" w:color="auto" w:fill="FFFFFF"/>
+            <w:shd w:val="clear" w:color="auto" w:fill="E2EFD9"/>
           </w:tcPr>
           <w:p>
             <w:pPr>
@@ -15117,7 +15118,7 @@
           <w:tcPr>
             <w:tcW w:type="dxa" w:w="4059"/>
             <w:gridSpan w:val="2"/>
-            <w:shd w:val="clear" w:color="auto" w:fill="FFFFFF"/>
+            <w:shd w:val="clear" w:color="auto" w:fill="E2EFD9"/>
           </w:tcPr>
           <w:p>
             <w:pPr>
@@ -15160,7 +15161,7 @@
         <w:tc>
           <w:tcPr>
             <w:tcW w:type="dxa" w:w="708"/>
-            <w:shd w:val="clear" w:color="auto" w:fill="FFFFFF"/>
+            <w:shd w:val="clear" w:color="auto" w:fill="E2EFD9"/>
             <w:vAlign w:val="center"/>
           </w:tcPr>
           <w:p>
@@ -15182,7 +15183,7 @@
         <w:tc>
           <w:tcPr>
             <w:tcW w:type="dxa" w:w="1560"/>
-            <w:shd w:val="clear" w:color="auto" w:fill="FFFFFF"/>
+            <w:shd w:val="clear" w:color="auto" w:fill="E2EFD9"/>
           </w:tcPr>
           <w:p>
             <w:pPr>
@@ -15204,7 +15205,7 @@
         <w:tc>
           <w:tcPr>
             <w:tcW w:type="dxa" w:w="1048"/>
-            <w:shd w:val="clear" w:color="auto" w:fill="FFFFFF"/>
+            <w:shd w:val="clear" w:color="auto" w:fill="E2EFD9"/>
           </w:tcPr>
           <w:p>
             <w:pPr>
@@ -15226,7 +15227,7 @@
           <w:tcPr>
             <w:tcW w:type="dxa" w:w="4059"/>
             <w:gridSpan w:val="2"/>
-            <w:shd w:val="clear" w:color="auto" w:fill="FFFFFF"/>
+            <w:shd w:val="clear" w:color="auto" w:fill="E2EFD9"/>
           </w:tcPr>
           <w:p>
             <w:pPr>
@@ -15269,7 +15270,7 @@
         <w:tc>
           <w:tcPr>
             <w:tcW w:type="dxa" w:w="708"/>
-            <w:shd w:val="clear" w:color="auto" w:fill="FFFFFF"/>
+            <w:shd w:val="clear" w:color="auto" w:fill="E2EFD9"/>
             <w:vAlign w:val="center"/>
           </w:tcPr>
           <w:p>
@@ -15291,7 +15292,7 @@
         <w:tc>
           <w:tcPr>
             <w:tcW w:type="dxa" w:w="1560"/>
-            <w:shd w:val="clear" w:color="auto" w:fill="FFFFFF"/>
+            <w:shd w:val="clear" w:color="auto" w:fill="E2EFD9"/>
           </w:tcPr>
           <w:p>
             <w:pPr>
@@ -15313,7 +15314,7 @@
         <w:tc>
           <w:tcPr>
             <w:tcW w:type="dxa" w:w="1048"/>
-            <w:shd w:val="clear" w:color="auto" w:fill="FFFFFF"/>
+            <w:shd w:val="clear" w:color="auto" w:fill="E2EFD9"/>
           </w:tcPr>
           <w:p>
             <w:pPr>
@@ -15335,7 +15336,7 @@
           <w:tcPr>
             <w:tcW w:type="dxa" w:w="4059"/>
             <w:gridSpan w:val="2"/>
-            <w:shd w:val="clear" w:color="auto" w:fill="FFFFFF"/>
+            <w:shd w:val="clear" w:color="auto" w:fill="E2EFD9"/>
           </w:tcPr>
           <w:p>
             <w:pPr>
@@ -15378,7 +15379,7 @@
         <w:tc>
           <w:tcPr>
             <w:tcW w:type="dxa" w:w="708"/>
-            <w:shd w:val="clear" w:color="auto" w:fill="FFFFFF"/>
+            <w:shd w:val="clear" w:color="auto" w:fill="E2EFD9"/>
             <w:vAlign w:val="center"/>
           </w:tcPr>
           <w:p>
@@ -15400,7 +15401,7 @@
         <w:tc>
           <w:tcPr>
             <w:tcW w:type="dxa" w:w="1560"/>
-            <w:shd w:val="clear" w:color="auto" w:fill="FFFFFF"/>
+            <w:shd w:val="clear" w:color="auto" w:fill="E2EFD9"/>
           </w:tcPr>
           <w:p>
             <w:pPr>
@@ -15422,7 +15423,7 @@
         <w:tc>
           <w:tcPr>
             <w:tcW w:type="dxa" w:w="1048"/>
-            <w:shd w:val="clear" w:color="auto" w:fill="FFFFFF"/>
+            <w:shd w:val="clear" w:color="auto" w:fill="E2EFD9"/>
           </w:tcPr>
           <w:p>
             <w:pPr>
@@ -15444,7 +15445,7 @@
           <w:tcPr>
             <w:tcW w:type="dxa" w:w="4059"/>
             <w:gridSpan w:val="2"/>
-            <w:shd w:val="clear" w:color="auto" w:fill="FFFFFF"/>
+            <w:shd w:val="clear" w:color="auto" w:fill="E2EFD9"/>
           </w:tcPr>
           <w:p>
             <w:pPr>
@@ -15487,7 +15488,7 @@
         <w:tc>
           <w:tcPr>
             <w:tcW w:type="dxa" w:w="708"/>
-            <w:shd w:val="clear" w:color="auto" w:fill="FFFFFF"/>
+            <w:shd w:val="clear" w:color="auto" w:fill="E2EFD9"/>
             <w:vAlign w:val="center"/>
           </w:tcPr>
           <w:p>
@@ -15509,7 +15510,7 @@
         <w:tc>
           <w:tcPr>
             <w:tcW w:type="dxa" w:w="1560"/>
-            <w:shd w:val="clear" w:color="auto" w:fill="FFFFFF"/>
+            <w:shd w:val="clear" w:color="auto" w:fill="E2EFD9"/>
           </w:tcPr>
           <w:p>
             <w:pPr>
@@ -15531,7 +15532,7 @@
         <w:tc>
           <w:tcPr>
             <w:tcW w:type="dxa" w:w="1048"/>
-            <w:shd w:val="clear" w:color="auto" w:fill="FFFFFF"/>
+            <w:shd w:val="clear" w:color="auto" w:fill="E2EFD9"/>
           </w:tcPr>
           <w:p>
             <w:pPr>
@@ -15553,7 +15554,7 @@
           <w:tcPr>
             <w:tcW w:type="dxa" w:w="4059"/>
             <w:gridSpan w:val="2"/>
-            <w:shd w:val="clear" w:color="auto" w:fill="FFFFFF"/>
+            <w:shd w:val="clear" w:color="auto" w:fill="E2EFD9"/>
           </w:tcPr>
           <w:p>
             <w:pPr>
@@ -15596,7 +15597,7 @@
         <w:tc>
           <w:tcPr>
             <w:tcW w:type="dxa" w:w="708"/>
-            <w:shd w:val="clear" w:color="auto" w:fill="FFFFFF"/>
+            <w:shd w:val="clear" w:color="auto" w:fill="E2EFD9"/>
             <w:vAlign w:val="center"/>
           </w:tcPr>
           <w:p>
@@ -15618,7 +15619,7 @@
         <w:tc>
           <w:tcPr>
             <w:tcW w:type="dxa" w:w="1560"/>
-            <w:shd w:val="clear" w:color="auto" w:fill="FFFFFF"/>
+            <w:shd w:val="clear" w:color="auto" w:fill="E2EFD9"/>
           </w:tcPr>
           <w:p>
             <w:pPr>
@@ -15640,7 +15641,7 @@
         <w:tc>
           <w:tcPr>
             <w:tcW w:type="dxa" w:w="1048"/>
-            <w:shd w:val="clear" w:color="auto" w:fill="FFFFFF"/>
+            <w:shd w:val="clear" w:color="auto" w:fill="E2EFD9"/>
           </w:tcPr>
           <w:p>
             <w:pPr>
@@ -15662,7 +15663,7 @@
           <w:tcPr>
             <w:tcW w:type="dxa" w:w="4059"/>
             <w:gridSpan w:val="2"/>
-            <w:shd w:val="clear" w:color="auto" w:fill="FFFFFF"/>
+            <w:shd w:val="clear" w:color="auto" w:fill="E2EFD9"/>
           </w:tcPr>
           <w:p>
             <w:pPr>
@@ -15705,7 +15706,7 @@
         <w:tc>
           <w:tcPr>
             <w:tcW w:type="dxa" w:w="708"/>
-            <w:shd w:val="clear" w:color="auto" w:fill="FFFFFF"/>
+            <w:shd w:val="clear" w:color="auto" w:fill="E2EFD9"/>
             <w:vAlign w:val="center"/>
           </w:tcPr>
           <w:p>
@@ -15727,7 +15728,7 @@
         <w:tc>
           <w:tcPr>
             <w:tcW w:type="dxa" w:w="1560"/>
-            <w:shd w:val="clear" w:color="auto" w:fill="FFFFFF"/>
+            <w:shd w:val="clear" w:color="auto" w:fill="E2EFD9"/>
           </w:tcPr>
           <w:p>
             <w:pPr>
@@ -15749,7 +15750,7 @@
         <w:tc>
           <w:tcPr>
             <w:tcW w:type="dxa" w:w="1048"/>
-            <w:shd w:val="clear" w:color="auto" w:fill="FFFFFF"/>
+            <w:shd w:val="clear" w:color="auto" w:fill="E2EFD9"/>
           </w:tcPr>
           <w:p>
             <w:pPr>
@@ -15771,7 +15772,7 @@
           <w:tcPr>
             <w:tcW w:type="dxa" w:w="4059"/>
             <w:gridSpan w:val="2"/>
-            <w:shd w:val="clear" w:color="auto" w:fill="FFFFFF"/>
+            <w:shd w:val="clear" w:color="auto" w:fill="E2EFD9"/>
           </w:tcPr>
           <w:p>
             <w:pPr>
@@ -15814,7 +15815,7 @@
         <w:tc>
           <w:tcPr>
             <w:tcW w:type="dxa" w:w="708"/>
-            <w:shd w:val="clear" w:color="auto" w:fill="FFFFFF"/>
+            <w:shd w:val="clear" w:color="auto" w:fill="E2EFD9"/>
             <w:vAlign w:val="center"/>
           </w:tcPr>
           <w:p>
@@ -15836,7 +15837,7 @@
         <w:tc>
           <w:tcPr>
             <w:tcW w:type="dxa" w:w="1560"/>
-            <w:shd w:val="clear" w:color="auto" w:fill="FFFFFF"/>
+            <w:shd w:val="clear" w:color="auto" w:fill="E2EFD9"/>
           </w:tcPr>
           <w:p>
             <w:pPr>
@@ -15858,7 +15859,7 @@
         <w:tc>
           <w:tcPr>
             <w:tcW w:type="dxa" w:w="1048"/>
-            <w:shd w:val="clear" w:color="auto" w:fill="FFFFFF"/>
+            <w:shd w:val="clear" w:color="auto" w:fill="E2EFD9"/>
           </w:tcPr>
           <w:p>
             <w:pPr>
@@ -15880,7 +15881,7 @@
           <w:tcPr>
             <w:tcW w:type="dxa" w:w="4059"/>
             <w:gridSpan w:val="2"/>
-            <w:shd w:val="clear" w:color="auto" w:fill="FFFFFF"/>
+            <w:shd w:val="clear" w:color="auto" w:fill="E2EFD9"/>
           </w:tcPr>
           <w:p>
             <w:pPr>
@@ -15948,7 +15949,7 @@
           <w:tcPr>
             <w:tcW w:type="dxa" w:w="7375"/>
             <w:gridSpan w:val="5"/>
-            <w:shd w:val="clear" w:color="auto" w:fill="FFFFFF"/>
+            <w:shd w:val="clear" w:color="auto" w:fill="E2EFD9"/>
           </w:tcPr>
           <w:p>
             <w:pPr>
@@ -16092,7 +16093,7 @@
           <w:tcPr>
             <w:tcW w:type="dxa" w:w="7375"/>
             <w:gridSpan w:val="5"/>
-            <w:shd w:val="clear" w:color="auto" w:fill="FFFFFF"/>
+            <w:shd w:val="clear" w:color="auto" w:fill="E2EFD9"/>
           </w:tcPr>
           <w:p>
             <w:pPr>
@@ -16796,7 +16797,7 @@
           <w:tcPr>
             <w:tcW w:type="dxa" w:w="7375"/>
             <w:gridSpan w:val="5"/>
-            <w:shd w:val="clear" w:color="auto" w:fill="FFFFFF"/>
+            <w:shd w:val="clear" w:color="auto" w:fill="E2EFD9"/>
           </w:tcPr>
           <w:p>
             <w:pPr>
@@ -16895,7 +16896,7 @@
           <w:tcPr>
             <w:tcW w:type="dxa" w:w="7375"/>
             <w:gridSpan w:val="5"/>
-            <w:shd w:val="clear" w:color="auto" w:fill="FFFFFF"/>
+            <w:shd w:val="clear" w:color="auto" w:fill="E2EFD9"/>
           </w:tcPr>
           <w:p>
             <w:pPr>
@@ -16995,7 +16996,7 @@
           <w:tcPr>
             <w:tcW w:type="dxa" w:w="7375"/>
             <w:gridSpan w:val="5"/>
-            <w:shd w:val="clear" w:color="auto" w:fill="FFFFFF"/>
+            <w:shd w:val="clear" w:color="auto" w:fill="E2EFD9"/>
           </w:tcPr>
           <w:p>
             <w:pPr>
@@ -17041,7 +17042,7 @@
           <w:tcPr>
             <w:tcW w:type="dxa" w:w="7375"/>
             <w:gridSpan w:val="5"/>
-            <w:shd w:val="clear" w:color="auto" w:fill="FFFFFF"/>
+            <w:shd w:val="clear" w:color="auto" w:fill="E2EFD9"/>
           </w:tcPr>
           <w:p>
             <w:pPr>

</xml_diff>